<commit_message>
feat: improve docx export, analyst assignment, and berita acara petugas data
- PdfTemplateController: fallback generate .docx from HTML when no Word template, add petugas variables (nama_admin, nama_penyelia, nama_manager_teknis) based on verification logs
- ExportController: extend export features
- Payment: add discountHistories relationship
- Seeder: add hasil_pengujian_rekap permission
- AnalystAssignment/UserAssignList: support assignment notes
- DownloadMenu, AdminDashboard, AdminBeritaAcaraDetail, AnalystRekapAnalis, UserPaymentDetail: UI improvements
- Update docs and add sample berita acara files
</commit_message>
<xml_diff>
--- a/backend/file/Lembar kendali sampel.docx
+++ b/backend/file/Lembar kendali sampel.docx
@@ -1,6 +1,6 @@
 
 <file path=word/document.xml><?xml version="1.0" encoding="utf-8"?>
-<w:document xmlns:wpc="http://schemas.microsoft.com/office/word/2010/wordprocessingCanvas" xmlns:cx="http://schemas.microsoft.com/office/drawing/2014/chartex" xmlns:cx1="http://schemas.microsoft.com/office/drawing/2015/9/8/chartex" xmlns:cx2="http://schemas.microsoft.com/office/drawing/2015/10/21/chartex" xmlns:cx3="http://schemas.microsoft.com/office/drawing/2016/5/9/chartex" xmlns:cx4="http://schemas.microsoft.com/office/drawing/2016/5/10/chartex" xmlns:cx5="http://schemas.microsoft.com/office/drawing/2016/5/11/chartex" xmlns:cx6="http://schemas.microsoft.com/office/drawing/2016/5/12/chartex" xmlns:cx7="http://schemas.microsoft.com/office/drawing/2016/5/13/chartex" xmlns:cx8="http://schemas.microsoft.com/office/drawing/2016/5/14/chartex" xmlns:mc="http://schemas.openxmlformats.org/markup-compatibility/2006" xmlns:aink="http://schemas.microsoft.com/office/drawing/2016/ink" xmlns:am3d="http://schemas.microsoft.com/office/drawing/2017/model3d" xmlns:o="urn:schemas-microsoft-com:office:office" xmlns:oel="http://schemas.microsoft.com/office/2019/extlst" xmlns:r="http://schemas.openxmlformats.org/officeDocument/2006/relationships" xmlns:m="http://schemas.openxmlformats.org/officeDocument/2006/math" xmlns:v="urn:schemas-microsoft-com:vml" xmlns:wp14="http://schemas.microsoft.com/office/word/2010/wordprocessingDrawing" xmlns:wp="http://schemas.openxmlformats.org/drawingml/2006/wordprocessingDrawing" xmlns:w10="urn:schemas-microsoft-com:office:word" xmlns:w="http://schemas.openxmlformats.org/wordprocessingml/2006/main" xmlns:w14="http://schemas.microsoft.com/office/word/2010/wordml" xmlns:w15="http://schemas.microsoft.com/office/word/2012/wordml" xmlns:w16cei="http://schemas.microsoft.com/office/word/2026/wordml/cei" xmlns:w16cex="http://schemas.microsoft.com/office/word/2018/wordml/cex" xmlns:w16cid="http://schemas.microsoft.com/office/word/2016/wordml/cid" xmlns:w16="http://schemas.microsoft.com/office/word/2018/wordml" xmlns:w16du="http://schemas.microsoft.com/office/word/2023/wordml/word16du" xmlns:w16sdtdh="http://schemas.microsoft.com/office/word/2020/wordml/sdtdatahash" xmlns:w16sdtfl="http://schemas.microsoft.com/office/word/2024/wordml/sdtformatlock" xmlns:w16se="http://schemas.microsoft.com/office/word/2015/wordml/symex" xmlns:wpg="http://schemas.microsoft.com/office/word/2010/wordprocessingGroup" xmlns:wpi="http://schemas.microsoft.com/office/word/2010/wordprocessingInk" xmlns:wne="http://schemas.microsoft.com/office/word/2006/wordml" xmlns:wps="http://schemas.microsoft.com/office/word/2010/wordprocessingShape" mc:Ignorable="w14 w15 w16se w16cid w16 w16cex w16sdtdh w16sdtfl w16du wp14">
+<w:document xmlns:wpc="http://schemas.microsoft.com/office/word/2010/wordprocessingCanvas" xmlns:cx="http://schemas.microsoft.com/office/drawing/2014/chartex" xmlns:cx1="http://schemas.microsoft.com/office/drawing/2015/9/8/chartex" xmlns:cx2="http://schemas.microsoft.com/office/drawing/2015/10/21/chartex" xmlns:cx3="http://schemas.microsoft.com/office/drawing/2016/5/9/chartex" xmlns:cx4="http://schemas.microsoft.com/office/drawing/2016/5/10/chartex" xmlns:cx5="http://schemas.microsoft.com/office/drawing/2016/5/11/chartex" xmlns:cx6="http://schemas.microsoft.com/office/drawing/2016/5/12/chartex" xmlns:cx7="http://schemas.microsoft.com/office/drawing/2016/5/13/chartex" xmlns:cx8="http://schemas.microsoft.com/office/drawing/2016/5/14/chartex" xmlns:mc="http://schemas.openxmlformats.org/markup-compatibility/2006" xmlns:aink="http://schemas.microsoft.com/office/drawing/2016/ink" xmlns:am3d="http://schemas.microsoft.com/office/drawing/2017/model3d" xmlns:o="urn:schemas-microsoft-com:office:office" xmlns:oel="http://schemas.microsoft.com/office/2019/extlst" xmlns:r="http://schemas.openxmlformats.org/officeDocument/2006/relationships" xmlns:m="http://schemas.openxmlformats.org/officeDocument/2006/math" xmlns:v="urn:schemas-microsoft-com:vml" xmlns:wp14="http://schemas.microsoft.com/office/word/2010/wordprocessingDrawing" xmlns:wp="http://schemas.openxmlformats.org/drawingml/2006/wordprocessingDrawing" xmlns:w10="urn:schemas-microsoft-com:office:word" xmlns:w="http://schemas.openxmlformats.org/wordprocessingml/2006/main" xmlns:w14="http://schemas.microsoft.com/office/word/2010/wordml" xmlns:w15="http://schemas.microsoft.com/office/word/2012/wordml" xmlns:w16cex="http://schemas.microsoft.com/office/word/2018/wordml/cex" xmlns:w16cid="http://schemas.microsoft.com/office/word/2016/wordml/cid" xmlns:w16="http://schemas.microsoft.com/office/word/2018/wordml" xmlns:w16du="http://schemas.microsoft.com/office/word/2023/wordml/word16du" xmlns:w16sdtdh="http://schemas.microsoft.com/office/word/2020/wordml/sdtdatahash" xmlns:w16sdtfl="http://schemas.microsoft.com/office/word/2024/wordml/sdtformatlock" xmlns:w16se="http://schemas.microsoft.com/office/word/2015/wordml/symex" xmlns:wpg="http://schemas.microsoft.com/office/word/2010/wordprocessingGroup" xmlns:wpi="http://schemas.microsoft.com/office/word/2010/wordprocessingInk" xmlns:wne="http://schemas.microsoft.com/office/word/2006/wordml" xmlns:wps="http://schemas.microsoft.com/office/word/2010/wordprocessingShape" mc:Ignorable="w14 w15 w16se w16cid w16 w16cex w16sdtdh w16sdtfl w16du wp14">
   <w:body>
     <w:p>
       <w:pPr>
@@ -225,8 +225,39 @@
                 <w:bCs/>
                 <w:color w:val="00AEEE"/>
               </w:rPr>
-              <w:t>UPT Laboratorium Terpadu</w:t>
-            </w:r>
+              <w:t xml:space="preserve">UPT </w:t>
+            </w:r>
+            <w:proofErr w:type="spellStart"/>
+            <w:r>
+              <w:rPr>
+                <w:rFonts w:ascii="Montserrat" w:eastAsia="Montserrat" w:hAnsi="Montserrat" w:cs="Montserrat"/>
+                <w:b/>
+                <w:bCs/>
+                <w:color w:val="00AEEE"/>
+              </w:rPr>
+              <w:t>Laboratorium</w:t>
+            </w:r>
+            <w:proofErr w:type="spellEnd"/>
+            <w:r>
+              <w:rPr>
+                <w:rFonts w:ascii="Montserrat" w:eastAsia="Montserrat" w:hAnsi="Montserrat" w:cs="Montserrat"/>
+                <w:b/>
+                <w:bCs/>
+                <w:color w:val="00AEEE"/>
+              </w:rPr>
+              <w:t xml:space="preserve"> </w:t>
+            </w:r>
+            <w:proofErr w:type="spellStart"/>
+            <w:r>
+              <w:rPr>
+                <w:rFonts w:ascii="Montserrat" w:eastAsia="Montserrat" w:hAnsi="Montserrat" w:cs="Montserrat"/>
+                <w:b/>
+                <w:bCs/>
+                <w:color w:val="00AEEE"/>
+              </w:rPr>
+              <w:t>Terpadu</w:t>
+            </w:r>
+            <w:proofErr w:type="spellEnd"/>
           </w:p>
           <w:p>
             <w:pPr>
@@ -245,7 +276,61 @@
                 <w:sz w:val="20"/>
                 <w:szCs w:val="20"/>
               </w:rPr>
-              <w:t>Jalan Ir. Sutami No. 36 A Kentingan, Jebres,</w:t>
+              <w:t xml:space="preserve">Jalan Ir. </w:t>
+            </w:r>
+            <w:proofErr w:type="spellStart"/>
+            <w:r>
+              <w:rPr>
+                <w:rFonts w:ascii="Montserrat" w:eastAsia="Montserrat" w:hAnsi="Montserrat" w:cs="Montserrat"/>
+                <w:sz w:val="20"/>
+                <w:szCs w:val="20"/>
+              </w:rPr>
+              <w:t>Sutami</w:t>
+            </w:r>
+            <w:proofErr w:type="spellEnd"/>
+            <w:r>
+              <w:rPr>
+                <w:rFonts w:ascii="Montserrat" w:eastAsia="Montserrat" w:hAnsi="Montserrat" w:cs="Montserrat"/>
+                <w:sz w:val="20"/>
+                <w:szCs w:val="20"/>
+              </w:rPr>
+              <w:t xml:space="preserve"> No. 36 A </w:t>
+            </w:r>
+            <w:proofErr w:type="spellStart"/>
+            <w:r>
+              <w:rPr>
+                <w:rFonts w:ascii="Montserrat" w:eastAsia="Montserrat" w:hAnsi="Montserrat" w:cs="Montserrat"/>
+                <w:sz w:val="20"/>
+                <w:szCs w:val="20"/>
+              </w:rPr>
+              <w:t>Kentingan</w:t>
+            </w:r>
+            <w:proofErr w:type="spellEnd"/>
+            <w:r>
+              <w:rPr>
+                <w:rFonts w:ascii="Montserrat" w:eastAsia="Montserrat" w:hAnsi="Montserrat" w:cs="Montserrat"/>
+                <w:sz w:val="20"/>
+                <w:szCs w:val="20"/>
+              </w:rPr>
+              <w:t xml:space="preserve">, </w:t>
+            </w:r>
+            <w:proofErr w:type="spellStart"/>
+            <w:r>
+              <w:rPr>
+                <w:rFonts w:ascii="Montserrat" w:eastAsia="Montserrat" w:hAnsi="Montserrat" w:cs="Montserrat"/>
+                <w:sz w:val="20"/>
+                <w:szCs w:val="20"/>
+              </w:rPr>
+              <w:t>Jebres</w:t>
+            </w:r>
+            <w:proofErr w:type="spellEnd"/>
+            <w:r>
+              <w:rPr>
+                <w:rFonts w:ascii="Montserrat" w:eastAsia="Montserrat" w:hAnsi="Montserrat" w:cs="Montserrat"/>
+                <w:sz w:val="20"/>
+                <w:szCs w:val="20"/>
+              </w:rPr>
+              <w:t>,</w:t>
             </w:r>
           </w:p>
           <w:p>
@@ -376,7 +461,7 @@
               </wp:anchor>
             </w:drawing>
           </mc:Choice>
-          <mc:Fallback xmlns:sl="http://schemas.openxmlformats.org/schemaLibrary/2006/main" xmlns:a="http://schemas.openxmlformats.org/drawingml/2006/main" xmlns:pic="http://schemas.openxmlformats.org/drawingml/2006/picture" xmlns:c="http://schemas.openxmlformats.org/drawingml/2006/chart" xmlns:lc="http://schemas.openxmlformats.org/drawingml/2006/lockedCanvas" xmlns:dgm="http://schemas.openxmlformats.org/drawingml/2006/diagram" xmlns="http://schemas.microsoft.com/office/tasks/2019/documenttasks" xmlns:cr="http://schemas.microsoft.com/office/comments/2020/reactions">
+          <mc:Fallback xmlns:cr="http://schemas.microsoft.com/office/comments/2020/reactions" xmlns="http://schemas.microsoft.com/office/tasks/2019/documenttasks" xmlns:dgm="http://schemas.openxmlformats.org/drawingml/2006/diagram" xmlns:lc="http://schemas.openxmlformats.org/drawingml/2006/lockedCanvas" xmlns:c="http://schemas.openxmlformats.org/drawingml/2006/chart" xmlns:pic="http://schemas.openxmlformats.org/drawingml/2006/picture" xmlns:a="http://schemas.openxmlformats.org/drawingml/2006/main" xmlns:sl="http://schemas.openxmlformats.org/schemaLibrary/2006/main" xmlns:w16cei="http://schemas.microsoft.com/office/word/2026/wordml/cei">
             <w:drawing>
               <wp:anchor allowOverlap="1" behindDoc="0" distB="0" distT="0" distL="114300" distR="114300" hidden="0" layoutInCell="1" locked="0" relativeHeight="0" simplePos="0">
                 <wp:simplePos x="0" y="0"/>
@@ -464,12 +549,42 @@
           <w:rFonts w:ascii="Calibri" w:eastAsia="Calibri" w:hAnsi="Calibri" w:cs="Calibri"/>
         </w:rPr>
       </w:pPr>
+      <w:proofErr w:type="spellStart"/>
       <w:r>
         <w:rPr>
           <w:rFonts w:ascii="Calibri" w:eastAsia="Calibri" w:hAnsi="Calibri" w:cs="Calibri"/>
         </w:rPr>
-        <w:t>Tanggal terima sampel</w:t>
+        <w:t>Tanggal</w:t>
       </w:r>
+      <w:proofErr w:type="spellEnd"/>
+      <w:r>
+        <w:rPr>
+          <w:rFonts w:ascii="Calibri" w:eastAsia="Calibri" w:hAnsi="Calibri" w:cs="Calibri"/>
+        </w:rPr>
+        <w:t xml:space="preserve"> </w:t>
+      </w:r>
+      <w:proofErr w:type="spellStart"/>
+      <w:r>
+        <w:rPr>
+          <w:rFonts w:ascii="Calibri" w:eastAsia="Calibri" w:hAnsi="Calibri" w:cs="Calibri"/>
+        </w:rPr>
+        <w:t>terima</w:t>
+      </w:r>
+      <w:proofErr w:type="spellEnd"/>
+      <w:r>
+        <w:rPr>
+          <w:rFonts w:ascii="Calibri" w:eastAsia="Calibri" w:hAnsi="Calibri" w:cs="Calibri"/>
+        </w:rPr>
+        <w:t xml:space="preserve"> </w:t>
+      </w:r>
+      <w:proofErr w:type="spellStart"/>
+      <w:r>
+        <w:rPr>
+          <w:rFonts w:ascii="Calibri" w:eastAsia="Calibri" w:hAnsi="Calibri" w:cs="Calibri"/>
+        </w:rPr>
+        <w:t>sampel</w:t>
+      </w:r>
+      <w:proofErr w:type="spellEnd"/>
       <w:r>
         <w:rPr>
           <w:rFonts w:ascii="Calibri" w:eastAsia="Calibri" w:hAnsi="Calibri" w:cs="Calibri"/>
@@ -484,7 +599,21 @@
         <w:rPr>
           <w:rFonts w:ascii="Calibri" w:eastAsia="Calibri" w:hAnsi="Calibri" w:cs="Calibri"/>
         </w:rPr>
-        <w:t>&lt;&lt;tanggal_berita_acara&gt;&gt;</w:t>
+        <w:t>&lt;&lt;</w:t>
+      </w:r>
+      <w:proofErr w:type="spellStart"/>
+      <w:r>
+        <w:rPr>
+          <w:rFonts w:ascii="Calibri" w:eastAsia="Calibri" w:hAnsi="Calibri" w:cs="Calibri"/>
+        </w:rPr>
+        <w:t>tanggal_berita_acara</w:t>
+      </w:r>
+      <w:proofErr w:type="spellEnd"/>
+      <w:r>
+        <w:rPr>
+          <w:rFonts w:ascii="Calibri" w:eastAsia="Calibri" w:hAnsi="Calibri" w:cs="Calibri"/>
+        </w:rPr>
+        <w:t>&gt;&gt;</w:t>
       </w:r>
       <w:r>
         <w:rPr>
@@ -523,7 +652,7 @@
         <w:rPr>
           <w:rFonts w:ascii="Calibri" w:eastAsia="Calibri" w:hAnsi="Calibri" w:cs="Calibri"/>
         </w:rPr>
-        <w:t xml:space="preserve">Asal Sampel: &lt;&lt;agenda&gt;&gt;</w:t>
+        <w:t>Asal Sampel: &lt;&lt;agenda&gt;&gt;</w:t>
       </w:r>
       <w:r>
         <w:rPr>
@@ -536,24 +665,6 @@
           <w:rFonts w:ascii="Calibri" w:eastAsia="Calibri" w:hAnsi="Calibri" w:cs="Calibri"/>
         </w:rPr>
         <w:tab/>
-        <w:t xml:space="preserve"/>
-      </w:r>
-      <w:r>
-        <w:rPr>
-          <w:rFonts w:ascii="Calibri" w:eastAsia="Calibri" w:hAnsi="Calibri" w:cs="Calibri"/>
-          <w:u w:val="single"/>
-        </w:rPr>
-        <w:t xml:space="preserve"/>
-      </w:r>
-      <w:r>
-        <w:rPr>
-          <w:rFonts w:ascii="Roboto" w:eastAsia="Roboto" w:hAnsi="Roboto" w:cs="Roboto"/>
-          <w:sz w:val="20"/>
-          <w:szCs w:val="20"/>
-          <w:highlight w:val="white"/>
-          <w:u w:val="single"/>
-        </w:rPr>
-        <w:t xml:space="preserve"/>
       </w:r>
     </w:p>
     <w:p>
@@ -567,7 +678,7 @@
     <w:tbl>
       <w:tblPr>
         <w:tblStyle w:val="a0"/>
-        <w:tblW w:w="9864" w:type="dxa"/>
+        <w:tblW w:w="9884" w:type="dxa"/>
         <w:tblInd w:w="-108" w:type="dxa"/>
         <w:tblBorders>
           <w:top w:val="single" w:sz="4" w:space="0" w:color="000000"/>
@@ -584,9 +695,8 @@
         <w:gridCol w:w="562"/>
         <w:gridCol w:w="2835"/>
         <w:gridCol w:w="1674"/>
-        <w:gridCol w:w="1461"/>
-        <w:gridCol w:w="1462"/>
-        <w:gridCol w:w="1870"/>
+        <w:gridCol w:w="2403"/>
+        <w:gridCol w:w="2410"/>
       </w:tblGrid>
       <w:tr>
         <w:trPr>
@@ -634,6 +744,7 @@
                 <w:bCs/>
               </w:rPr>
             </w:pPr>
+            <w:proofErr w:type="spellStart"/>
             <w:r>
               <w:rPr>
                 <w:rFonts w:ascii="Calibri" w:eastAsia="Calibri" w:hAnsi="Calibri" w:cs="Calibri"/>
@@ -642,6 +753,7 @@
               </w:rPr>
               <w:t>Kegiatan</w:t>
             </w:r>
+            <w:proofErr w:type="spellEnd"/>
           </w:p>
         </w:tc>
         <w:tc>
@@ -660,6 +772,7 @@
                 <w:bCs/>
               </w:rPr>
             </w:pPr>
+            <w:proofErr w:type="spellStart"/>
             <w:r>
               <w:rPr>
                 <w:rFonts w:ascii="Calibri" w:eastAsia="Calibri" w:hAnsi="Calibri" w:cs="Calibri"/>
@@ -668,11 +781,12 @@
               </w:rPr>
               <w:t>Tanggal</w:t>
             </w:r>
-          </w:p>
-        </w:tc>
-        <w:tc>
-          <w:tcPr>
-            <w:tcW w:w="2923" w:type="dxa"/>
+            <w:proofErr w:type="spellEnd"/>
+          </w:p>
+        </w:tc>
+        <w:tc>
+          <w:tcPr>
+            <w:tcW w:w="4813" w:type="dxa"/>
             <w:gridSpan w:val="2"/>
             <w:shd w:val="clear" w:color="auto" w:fill="BFBFBF"/>
             <w:vAlign w:val="center"/>
@@ -686,39 +800,23 @@
                 <w:bCs/>
               </w:rPr>
             </w:pPr>
+            <w:proofErr w:type="spellStart"/>
             <w:r>
               <w:rPr>
                 <w:rFonts w:ascii="Calibri" w:eastAsia="Calibri" w:hAnsi="Calibri" w:cs="Calibri"/>
                 <w:b/>
                 <w:bCs/>
               </w:rPr>
-              <w:t>Penanggung Jawab</w:t>
-            </w:r>
-          </w:p>
-        </w:tc>
-        <w:tc>
-          <w:tcPr>
-            <w:tcW w:w="1870" w:type="dxa"/>
-            <w:vMerge w:val="restart"/>
-            <w:shd w:val="clear" w:color="auto" w:fill="BFBFBF"/>
-            <w:vAlign w:val="center"/>
-          </w:tcPr>
-          <w:p>
-            <w:pPr>
-              <w:jc w:val="center"/>
+              <w:t>Penanggung</w:t>
+            </w:r>
+            <w:proofErr w:type="spellEnd"/>
+            <w:r>
               <w:rPr>
                 <w:rFonts w:ascii="Calibri" w:eastAsia="Calibri" w:hAnsi="Calibri" w:cs="Calibri"/>
                 <w:b/>
                 <w:bCs/>
               </w:rPr>
-            </w:pPr>
-            <w:r>
-              <w:rPr>
-                <w:rFonts w:ascii="Calibri" w:eastAsia="Calibri" w:hAnsi="Calibri" w:cs="Calibri"/>
-                <w:b/>
-                <w:bCs/>
-              </w:rPr>
-              <w:t>Catatan</w:t>
+              <w:t xml:space="preserve"> Jawab</w:t>
             </w:r>
           </w:p>
         </w:tc>
@@ -786,7 +884,7 @@
         </w:tc>
         <w:tc>
           <w:tcPr>
-            <w:tcW w:w="1461" w:type="dxa"/>
+            <w:tcW w:w="2403" w:type="dxa"/>
             <w:shd w:val="clear" w:color="auto" w:fill="BFBFBF"/>
           </w:tcPr>
           <w:p>
@@ -810,7 +908,7 @@
         </w:tc>
         <w:tc>
           <w:tcPr>
-            <w:tcW w:w="1462" w:type="dxa"/>
+            <w:tcW w:w="2410" w:type="dxa"/>
             <w:shd w:val="clear" w:color="auto" w:fill="BFBFBF"/>
           </w:tcPr>
           <w:p>
@@ -822,6 +920,7 @@
                 <w:bCs/>
               </w:rPr>
             </w:pPr>
+            <w:proofErr w:type="spellStart"/>
             <w:r>
               <w:rPr>
                 <w:rFonts w:ascii="Calibri" w:eastAsia="Calibri" w:hAnsi="Calibri" w:cs="Calibri"/>
@@ -830,25 +929,7 @@
               </w:rPr>
               <w:t>Jabatan</w:t>
             </w:r>
-          </w:p>
-        </w:tc>
-        <w:tc>
-          <w:tcPr>
-            <w:tcW w:w="1870" w:type="dxa"/>
-            <w:vMerge/>
-            <w:shd w:val="clear" w:color="auto" w:fill="BFBFBF"/>
-            <w:vAlign w:val="center"/>
-          </w:tcPr>
-          <w:p>
-            <w:pPr>
-              <w:widowControl w:val="0"/>
-              <w:spacing w:line="276" w:lineRule="auto"/>
-              <w:rPr>
-                <w:rFonts w:ascii="Calibri" w:eastAsia="Calibri" w:hAnsi="Calibri" w:cs="Calibri"/>
-                <w:b/>
-                <w:bCs/>
-              </w:rPr>
-            </w:pPr>
+            <w:proofErr w:type="spellEnd"/>
           </w:p>
         </w:tc>
       </w:tr>
@@ -882,11 +963,19 @@
                 <w:rFonts w:ascii="Calibri" w:eastAsia="Calibri" w:hAnsi="Calibri" w:cs="Calibri"/>
               </w:rPr>
             </w:pPr>
-            <w:r>
-              <w:rPr>
-                <w:rFonts w:ascii="Calibri" w:eastAsia="Calibri" w:hAnsi="Calibri" w:cs="Calibri"/>
-              </w:rPr>
-              <w:t>Penerimaan sampel</w:t>
+            <w:proofErr w:type="spellStart"/>
+            <w:r>
+              <w:rPr>
+                <w:rFonts w:ascii="Calibri" w:eastAsia="Calibri" w:hAnsi="Calibri" w:cs="Calibri"/>
+              </w:rPr>
+              <w:t>Pembuatan</w:t>
+            </w:r>
+            <w:proofErr w:type="spellEnd"/>
+            <w:r>
+              <w:rPr>
+                <w:rFonts w:ascii="Calibri" w:eastAsia="Calibri" w:hAnsi="Calibri" w:cs="Calibri"/>
+              </w:rPr>
+              <w:t xml:space="preserve"> Berita Acara</w:t>
             </w:r>
           </w:p>
         </w:tc>
@@ -904,31 +993,19 @@
         </w:tc>
         <w:tc>
           <w:tcPr>
-            <w:tcW w:w="1461" w:type="dxa"/>
-          </w:tcPr>
-          <w:p>
-            <w:pPr>
-              <w:rPr>
-                <w:rFonts w:ascii="Calibri" w:eastAsia="Calibri" w:hAnsi="Calibri" w:cs="Calibri"/>
-              </w:rPr>
-            </w:pPr>
-          </w:p>
-        </w:tc>
-        <w:tc>
-          <w:tcPr>
-            <w:tcW w:w="1462" w:type="dxa"/>
-          </w:tcPr>
-          <w:p>
-            <w:pPr>
-              <w:rPr>
-                <w:rFonts w:ascii="Calibri" w:eastAsia="Calibri" w:hAnsi="Calibri" w:cs="Calibri"/>
-              </w:rPr>
-            </w:pPr>
-          </w:p>
-        </w:tc>
-        <w:tc>
-          <w:tcPr>
-            <w:tcW w:w="1870" w:type="dxa"/>
+            <w:tcW w:w="2403" w:type="dxa"/>
+          </w:tcPr>
+          <w:p>
+            <w:pPr>
+              <w:rPr>
+                <w:rFonts w:ascii="Calibri" w:eastAsia="Calibri" w:hAnsi="Calibri" w:cs="Calibri"/>
+              </w:rPr>
+            </w:pPr>
+          </w:p>
+        </w:tc>
+        <w:tc>
+          <w:tcPr>
+            <w:tcW w:w="2410" w:type="dxa"/>
           </w:tcPr>
           <w:p>
             <w:pPr>
@@ -964,17 +1041,33 @@
           </w:tcPr>
           <w:p>
             <w:pPr>
-              <w:spacing w:before="60" w:after="60"/>
-              <w:rPr>
-                <w:rFonts w:ascii="Calibri" w:eastAsia="Calibri" w:hAnsi="Calibri" w:cs="Calibri"/>
-              </w:rPr>
-            </w:pPr>
-            <w:r>
-              <w:rPr>
-                <w:rFonts w:ascii="Calibri" w:eastAsia="Calibri" w:hAnsi="Calibri" w:cs="Calibri"/>
-              </w:rPr>
-              <w:t>Pembagian Analis</w:t>
-            </w:r>
+              <w:spacing w:before="60" w:after="120"/>
+              <w:rPr>
+                <w:rFonts w:ascii="Calibri" w:eastAsia="Calibri" w:hAnsi="Calibri" w:cs="Calibri"/>
+              </w:rPr>
+            </w:pPr>
+            <w:proofErr w:type="spellStart"/>
+            <w:r>
+              <w:rPr>
+                <w:rFonts w:ascii="Calibri" w:eastAsia="Calibri" w:hAnsi="Calibri" w:cs="Calibri"/>
+              </w:rPr>
+              <w:t>Penerimaan</w:t>
+            </w:r>
+            <w:proofErr w:type="spellEnd"/>
+            <w:r>
+              <w:rPr>
+                <w:rFonts w:ascii="Calibri" w:eastAsia="Calibri" w:hAnsi="Calibri" w:cs="Calibri"/>
+              </w:rPr>
+              <w:t xml:space="preserve"> </w:t>
+            </w:r>
+            <w:proofErr w:type="spellStart"/>
+            <w:r>
+              <w:rPr>
+                <w:rFonts w:ascii="Calibri" w:eastAsia="Calibri" w:hAnsi="Calibri" w:cs="Calibri"/>
+              </w:rPr>
+              <w:t>sampel</w:t>
+            </w:r>
+            <w:proofErr w:type="spellEnd"/>
           </w:p>
         </w:tc>
         <w:tc>
@@ -991,31 +1084,19 @@
         </w:tc>
         <w:tc>
           <w:tcPr>
-            <w:tcW w:w="1461" w:type="dxa"/>
-          </w:tcPr>
-          <w:p>
-            <w:pPr>
-              <w:rPr>
-                <w:rFonts w:ascii="Calibri" w:eastAsia="Calibri" w:hAnsi="Calibri" w:cs="Calibri"/>
-              </w:rPr>
-            </w:pPr>
-          </w:p>
-        </w:tc>
-        <w:tc>
-          <w:tcPr>
-            <w:tcW w:w="1462" w:type="dxa"/>
-          </w:tcPr>
-          <w:p>
-            <w:pPr>
-              <w:rPr>
-                <w:rFonts w:ascii="Calibri" w:eastAsia="Calibri" w:hAnsi="Calibri" w:cs="Calibri"/>
-              </w:rPr>
-            </w:pPr>
-          </w:p>
-        </w:tc>
-        <w:tc>
-          <w:tcPr>
-            <w:tcW w:w="1870" w:type="dxa"/>
+            <w:tcW w:w="2403" w:type="dxa"/>
+          </w:tcPr>
+          <w:p>
+            <w:pPr>
+              <w:rPr>
+                <w:rFonts w:ascii="Calibri" w:eastAsia="Calibri" w:hAnsi="Calibri" w:cs="Calibri"/>
+              </w:rPr>
+            </w:pPr>
+          </w:p>
+        </w:tc>
+        <w:tc>
+          <w:tcPr>
+            <w:tcW w:w="2410" w:type="dxa"/>
           </w:tcPr>
           <w:p>
             <w:pPr>
@@ -1051,17 +1132,33 @@
           </w:tcPr>
           <w:p>
             <w:pPr>
-              <w:spacing w:before="60" w:after="60"/>
-              <w:rPr>
-                <w:rFonts w:ascii="Calibri" w:eastAsia="Calibri" w:hAnsi="Calibri" w:cs="Calibri"/>
-              </w:rPr>
-            </w:pPr>
-            <w:r>
-              <w:rPr>
-                <w:rFonts w:ascii="Calibri" w:eastAsia="Calibri" w:hAnsi="Calibri" w:cs="Calibri"/>
-              </w:rPr>
-              <w:t>Kegiatan Analisis</w:t>
-            </w:r>
+              <w:spacing w:before="60" w:after="120"/>
+              <w:rPr>
+                <w:rFonts w:ascii="Calibri" w:eastAsia="Calibri" w:hAnsi="Calibri" w:cs="Calibri"/>
+              </w:rPr>
+            </w:pPr>
+            <w:proofErr w:type="spellStart"/>
+            <w:r>
+              <w:rPr>
+                <w:rFonts w:ascii="Calibri" w:eastAsia="Calibri" w:hAnsi="Calibri" w:cs="Calibri"/>
+              </w:rPr>
+              <w:t>Verifikasi</w:t>
+            </w:r>
+            <w:proofErr w:type="spellEnd"/>
+            <w:r>
+              <w:rPr>
+                <w:rFonts w:ascii="Calibri" w:eastAsia="Calibri" w:hAnsi="Calibri" w:cs="Calibri"/>
+              </w:rPr>
+              <w:t xml:space="preserve"> </w:t>
+            </w:r>
+            <w:proofErr w:type="spellStart"/>
+            <w:r>
+              <w:rPr>
+                <w:rFonts w:ascii="Calibri" w:eastAsia="Calibri" w:hAnsi="Calibri" w:cs="Calibri"/>
+              </w:rPr>
+              <w:t>Penyelia</w:t>
+            </w:r>
+            <w:proofErr w:type="spellEnd"/>
           </w:p>
         </w:tc>
         <w:tc>
@@ -1078,31 +1175,19 @@
         </w:tc>
         <w:tc>
           <w:tcPr>
-            <w:tcW w:w="1461" w:type="dxa"/>
-          </w:tcPr>
-          <w:p>
-            <w:pPr>
-              <w:rPr>
-                <w:rFonts w:ascii="Calibri" w:eastAsia="Calibri" w:hAnsi="Calibri" w:cs="Calibri"/>
-              </w:rPr>
-            </w:pPr>
-          </w:p>
-        </w:tc>
-        <w:tc>
-          <w:tcPr>
-            <w:tcW w:w="1462" w:type="dxa"/>
-          </w:tcPr>
-          <w:p>
-            <w:pPr>
-              <w:rPr>
-                <w:rFonts w:ascii="Calibri" w:eastAsia="Calibri" w:hAnsi="Calibri" w:cs="Calibri"/>
-              </w:rPr>
-            </w:pPr>
-          </w:p>
-        </w:tc>
-        <w:tc>
-          <w:tcPr>
-            <w:tcW w:w="1870" w:type="dxa"/>
+            <w:tcW w:w="2403" w:type="dxa"/>
+          </w:tcPr>
+          <w:p>
+            <w:pPr>
+              <w:rPr>
+                <w:rFonts w:ascii="Calibri" w:eastAsia="Calibri" w:hAnsi="Calibri" w:cs="Calibri"/>
+              </w:rPr>
+            </w:pPr>
+          </w:p>
+        </w:tc>
+        <w:tc>
+          <w:tcPr>
+            <w:tcW w:w="2410" w:type="dxa"/>
           </w:tcPr>
           <w:p>
             <w:pPr>
@@ -1138,16 +1223,24 @@
           </w:tcPr>
           <w:p>
             <w:pPr>
-              <w:spacing w:before="60"/>
-              <w:rPr>
-                <w:rFonts w:ascii="Calibri" w:eastAsia="Calibri" w:hAnsi="Calibri" w:cs="Calibri"/>
-              </w:rPr>
-            </w:pPr>
-            <w:r>
-              <w:rPr>
-                <w:rFonts w:ascii="Calibri" w:eastAsia="Calibri" w:hAnsi="Calibri" w:cs="Calibri"/>
-              </w:rPr>
-              <w:t>Pembuatan draft hasil</w:t>
+              <w:spacing w:before="60" w:after="60"/>
+              <w:rPr>
+                <w:rFonts w:ascii="Calibri" w:eastAsia="Calibri" w:hAnsi="Calibri" w:cs="Calibri"/>
+              </w:rPr>
+            </w:pPr>
+            <w:proofErr w:type="spellStart"/>
+            <w:r>
+              <w:rPr>
+                <w:rFonts w:ascii="Calibri" w:eastAsia="Calibri" w:hAnsi="Calibri" w:cs="Calibri"/>
+              </w:rPr>
+              <w:t>Pembagian</w:t>
+            </w:r>
+            <w:proofErr w:type="spellEnd"/>
+            <w:r>
+              <w:rPr>
+                <w:rFonts w:ascii="Calibri" w:eastAsia="Calibri" w:hAnsi="Calibri" w:cs="Calibri"/>
+              </w:rPr>
+              <w:t xml:space="preserve"> Analis</w:t>
             </w:r>
           </w:p>
         </w:tc>
@@ -1165,31 +1258,19 @@
         </w:tc>
         <w:tc>
           <w:tcPr>
-            <w:tcW w:w="1461" w:type="dxa"/>
-          </w:tcPr>
-          <w:p>
-            <w:pPr>
-              <w:rPr>
-                <w:rFonts w:ascii="Calibri" w:eastAsia="Calibri" w:hAnsi="Calibri" w:cs="Calibri"/>
-              </w:rPr>
-            </w:pPr>
-          </w:p>
-        </w:tc>
-        <w:tc>
-          <w:tcPr>
-            <w:tcW w:w="1462" w:type="dxa"/>
-          </w:tcPr>
-          <w:p>
-            <w:pPr>
-              <w:rPr>
-                <w:rFonts w:ascii="Calibri" w:eastAsia="Calibri" w:hAnsi="Calibri" w:cs="Calibri"/>
-              </w:rPr>
-            </w:pPr>
-          </w:p>
-        </w:tc>
-        <w:tc>
-          <w:tcPr>
-            <w:tcW w:w="1870" w:type="dxa"/>
+            <w:tcW w:w="2403" w:type="dxa"/>
+          </w:tcPr>
+          <w:p>
+            <w:pPr>
+              <w:rPr>
+                <w:rFonts w:ascii="Calibri" w:eastAsia="Calibri" w:hAnsi="Calibri" w:cs="Calibri"/>
+              </w:rPr>
+            </w:pPr>
+          </w:p>
+        </w:tc>
+        <w:tc>
+          <w:tcPr>
+            <w:tcW w:w="2410" w:type="dxa"/>
           </w:tcPr>
           <w:p>
             <w:pPr>
@@ -1228,13 +1309,36 @@
               <w:spacing w:before="60"/>
               <w:rPr>
                 <w:rFonts w:ascii="Calibri" w:eastAsia="Calibri" w:hAnsi="Calibri" w:cs="Calibri"/>
-              </w:rPr>
-            </w:pPr>
-            <w:r>
-              <w:rPr>
-                <w:rFonts w:ascii="Calibri" w:eastAsia="Calibri" w:hAnsi="Calibri" w:cs="Calibri"/>
-              </w:rPr>
-              <w:t>Pemeriksaan draft hasil</w:t>
+                <w:lang w:val="fi-FI"/>
+              </w:rPr>
+            </w:pPr>
+            <w:r>
+              <w:rPr>
+                <w:rFonts w:ascii="Calibri" w:eastAsia="Calibri" w:hAnsi="Calibri" w:cs="Calibri"/>
+                <w:lang w:val="fi-FI"/>
+              </w:rPr>
+              <w:t>Draft hasil</w:t>
+            </w:r>
+            <w:r>
+              <w:rPr>
+                <w:rFonts w:ascii="Calibri" w:eastAsia="Calibri" w:hAnsi="Calibri" w:cs="Calibri"/>
+                <w:lang w:val="fi-FI"/>
+              </w:rPr>
+              <w:t xml:space="preserve"> diserahkan</w:t>
+            </w:r>
+            <w:r>
+              <w:rPr>
+                <w:rFonts w:ascii="Calibri" w:eastAsia="Calibri" w:hAnsi="Calibri" w:cs="Calibri"/>
+                <w:lang w:val="fi-FI"/>
+              </w:rPr>
+              <w:t xml:space="preserve"> Anali</w:t>
+            </w:r>
+            <w:r>
+              <w:rPr>
+                <w:rFonts w:ascii="Calibri" w:eastAsia="Calibri" w:hAnsi="Calibri" w:cs="Calibri"/>
+                <w:lang w:val="fi-FI"/>
+              </w:rPr>
+              <w:t>s</w:t>
             </w:r>
           </w:p>
         </w:tc>
@@ -1246,42 +1350,33 @@
             <w:pPr>
               <w:rPr>
                 <w:rFonts w:ascii="Calibri" w:eastAsia="Calibri" w:hAnsi="Calibri" w:cs="Calibri"/>
-              </w:rPr>
-            </w:pPr>
-          </w:p>
-        </w:tc>
-        <w:tc>
-          <w:tcPr>
-            <w:tcW w:w="1461" w:type="dxa"/>
-          </w:tcPr>
-          <w:p>
-            <w:pPr>
-              <w:rPr>
-                <w:rFonts w:ascii="Calibri" w:eastAsia="Calibri" w:hAnsi="Calibri" w:cs="Calibri"/>
-              </w:rPr>
-            </w:pPr>
-          </w:p>
-        </w:tc>
-        <w:tc>
-          <w:tcPr>
-            <w:tcW w:w="1462" w:type="dxa"/>
-          </w:tcPr>
-          <w:p>
-            <w:pPr>
-              <w:rPr>
-                <w:rFonts w:ascii="Calibri" w:eastAsia="Calibri" w:hAnsi="Calibri" w:cs="Calibri"/>
-              </w:rPr>
-            </w:pPr>
-          </w:p>
-        </w:tc>
-        <w:tc>
-          <w:tcPr>
-            <w:tcW w:w="1870" w:type="dxa"/>
-          </w:tcPr>
-          <w:p>
-            <w:pPr>
-              <w:rPr>
-                <w:rFonts w:ascii="Calibri" w:eastAsia="Calibri" w:hAnsi="Calibri" w:cs="Calibri"/>
+                <w:lang w:val="fi-FI"/>
+              </w:rPr>
+            </w:pPr>
+          </w:p>
+        </w:tc>
+        <w:tc>
+          <w:tcPr>
+            <w:tcW w:w="2403" w:type="dxa"/>
+          </w:tcPr>
+          <w:p>
+            <w:pPr>
+              <w:rPr>
+                <w:rFonts w:ascii="Calibri" w:eastAsia="Calibri" w:hAnsi="Calibri" w:cs="Calibri"/>
+                <w:lang w:val="fi-FI"/>
+              </w:rPr>
+            </w:pPr>
+          </w:p>
+        </w:tc>
+        <w:tc>
+          <w:tcPr>
+            <w:tcW w:w="2410" w:type="dxa"/>
+          </w:tcPr>
+          <w:p>
+            <w:pPr>
+              <w:rPr>
+                <w:rFonts w:ascii="Calibri" w:eastAsia="Calibri" w:hAnsi="Calibri" w:cs="Calibri"/>
+                <w:lang w:val="fi-FI"/>
               </w:rPr>
             </w:pPr>
           </w:p>
@@ -1291,9 +1386,6 @@
         <w:tc>
           <w:tcPr>
             <w:tcW w:w="562" w:type="dxa"/>
-            <w:tcBorders>
-              <w:bottom w:val="single" w:sz="4" w:space="0" w:color="000000"/>
-            </w:tcBorders>
           </w:tcPr>
           <w:p>
             <w:pPr>
@@ -1305,6 +1397,7 @@
               <w:ind w:left="457"/>
               <w:rPr>
                 <w:rFonts w:ascii="Calibri" w:eastAsia="Calibri" w:hAnsi="Calibri" w:cs="Calibri"/>
+                <w:lang w:val="fi-FI"/>
               </w:rPr>
             </w:pPr>
           </w:p>
@@ -1320,12 +1413,28 @@
                 <w:rFonts w:ascii="Calibri" w:eastAsia="Calibri" w:hAnsi="Calibri" w:cs="Calibri"/>
               </w:rPr>
             </w:pPr>
-            <w:r>
-              <w:rPr>
-                <w:rFonts w:ascii="Calibri" w:eastAsia="Calibri" w:hAnsi="Calibri" w:cs="Calibri"/>
-              </w:rPr>
-              <w:t>Perbaikan draft hasil</w:t>
-            </w:r>
+            <w:proofErr w:type="spellStart"/>
+            <w:r>
+              <w:rPr>
+                <w:rFonts w:ascii="Calibri" w:eastAsia="Calibri" w:hAnsi="Calibri" w:cs="Calibri"/>
+              </w:rPr>
+              <w:t>Pemeriksaan</w:t>
+            </w:r>
+            <w:proofErr w:type="spellEnd"/>
+            <w:r>
+              <w:rPr>
+                <w:rFonts w:ascii="Calibri" w:eastAsia="Calibri" w:hAnsi="Calibri" w:cs="Calibri"/>
+              </w:rPr>
+              <w:t xml:space="preserve"> draft </w:t>
+            </w:r>
+            <w:proofErr w:type="spellStart"/>
+            <w:r>
+              <w:rPr>
+                <w:rFonts w:ascii="Calibri" w:eastAsia="Calibri" w:hAnsi="Calibri" w:cs="Calibri"/>
+              </w:rPr>
+              <w:t>hasil</w:t>
+            </w:r>
+            <w:proofErr w:type="spellEnd"/>
           </w:p>
         </w:tc>
         <w:tc>
@@ -1342,31 +1451,19 @@
         </w:tc>
         <w:tc>
           <w:tcPr>
-            <w:tcW w:w="1461" w:type="dxa"/>
-          </w:tcPr>
-          <w:p>
-            <w:pPr>
-              <w:rPr>
-                <w:rFonts w:ascii="Calibri" w:eastAsia="Calibri" w:hAnsi="Calibri" w:cs="Calibri"/>
-              </w:rPr>
-            </w:pPr>
-          </w:p>
-        </w:tc>
-        <w:tc>
-          <w:tcPr>
-            <w:tcW w:w="1462" w:type="dxa"/>
-          </w:tcPr>
-          <w:p>
-            <w:pPr>
-              <w:rPr>
-                <w:rFonts w:ascii="Calibri" w:eastAsia="Calibri" w:hAnsi="Calibri" w:cs="Calibri"/>
-              </w:rPr>
-            </w:pPr>
-          </w:p>
-        </w:tc>
-        <w:tc>
-          <w:tcPr>
-            <w:tcW w:w="1870" w:type="dxa"/>
+            <w:tcW w:w="2403" w:type="dxa"/>
+          </w:tcPr>
+          <w:p>
+            <w:pPr>
+              <w:rPr>
+                <w:rFonts w:ascii="Calibri" w:eastAsia="Calibri" w:hAnsi="Calibri" w:cs="Calibri"/>
+              </w:rPr>
+            </w:pPr>
+          </w:p>
+        </w:tc>
+        <w:tc>
+          <w:tcPr>
+            <w:tcW w:w="2410" w:type="dxa"/>
           </w:tcPr>
           <w:p>
             <w:pPr>
@@ -1381,12 +1478,6 @@
         <w:tc>
           <w:tcPr>
             <w:tcW w:w="562" w:type="dxa"/>
-            <w:tcBorders>
-              <w:top w:val="single" w:sz="4" w:space="0" w:color="000000"/>
-              <w:left w:val="single" w:sz="4" w:space="0" w:color="000000"/>
-              <w:bottom w:val="nil"/>
-              <w:right w:val="single" w:sz="4" w:space="0" w:color="000000"/>
-            </w:tcBorders>
           </w:tcPr>
           <w:p>
             <w:pPr>
@@ -1405,23 +1496,36 @@
         <w:tc>
           <w:tcPr>
             <w:tcW w:w="2835" w:type="dxa"/>
-            <w:tcBorders>
-              <w:left w:val="single" w:sz="4" w:space="0" w:color="000000"/>
-            </w:tcBorders>
-          </w:tcPr>
-          <w:p>
-            <w:pPr>
-              <w:spacing w:before="60" w:after="60"/>
-              <w:rPr>
-                <w:rFonts w:ascii="Calibri" w:eastAsia="Calibri" w:hAnsi="Calibri" w:cs="Calibri"/>
-              </w:rPr>
-            </w:pPr>
-            <w:r>
-              <w:rPr>
-                <w:rFonts w:ascii="Calibri" w:eastAsia="Calibri" w:hAnsi="Calibri" w:cs="Calibri"/>
-              </w:rPr>
-              <w:t>Tanda tangan hasil</w:t>
-            </w:r>
+          </w:tcPr>
+          <w:p>
+            <w:pPr>
+              <w:spacing w:before="60"/>
+              <w:rPr>
+                <w:rFonts w:ascii="Calibri" w:eastAsia="Calibri" w:hAnsi="Calibri" w:cs="Calibri"/>
+              </w:rPr>
+            </w:pPr>
+            <w:proofErr w:type="spellStart"/>
+            <w:r>
+              <w:rPr>
+                <w:rFonts w:ascii="Calibri" w:eastAsia="Calibri" w:hAnsi="Calibri" w:cs="Calibri"/>
+              </w:rPr>
+              <w:t>Perbaikan</w:t>
+            </w:r>
+            <w:proofErr w:type="spellEnd"/>
+            <w:r>
+              <w:rPr>
+                <w:rFonts w:ascii="Calibri" w:eastAsia="Calibri" w:hAnsi="Calibri" w:cs="Calibri"/>
+              </w:rPr>
+              <w:t xml:space="preserve"> draft </w:t>
+            </w:r>
+            <w:proofErr w:type="spellStart"/>
+            <w:r>
+              <w:rPr>
+                <w:rFonts w:ascii="Calibri" w:eastAsia="Calibri" w:hAnsi="Calibri" w:cs="Calibri"/>
+              </w:rPr>
+              <w:t>hasil</w:t>
+            </w:r>
+            <w:proofErr w:type="spellEnd"/>
           </w:p>
         </w:tc>
         <w:tc>
@@ -1438,31 +1542,19 @@
         </w:tc>
         <w:tc>
           <w:tcPr>
-            <w:tcW w:w="1461" w:type="dxa"/>
-          </w:tcPr>
-          <w:p>
-            <w:pPr>
-              <w:rPr>
-                <w:rFonts w:ascii="Calibri" w:eastAsia="Calibri" w:hAnsi="Calibri" w:cs="Calibri"/>
-              </w:rPr>
-            </w:pPr>
-          </w:p>
-        </w:tc>
-        <w:tc>
-          <w:tcPr>
-            <w:tcW w:w="1462" w:type="dxa"/>
-          </w:tcPr>
-          <w:p>
-            <w:pPr>
-              <w:rPr>
-                <w:rFonts w:ascii="Calibri" w:eastAsia="Calibri" w:hAnsi="Calibri" w:cs="Calibri"/>
-              </w:rPr>
-            </w:pPr>
-          </w:p>
-        </w:tc>
-        <w:tc>
-          <w:tcPr>
-            <w:tcW w:w="1870" w:type="dxa"/>
+            <w:tcW w:w="2403" w:type="dxa"/>
+          </w:tcPr>
+          <w:p>
+            <w:pPr>
+              <w:rPr>
+                <w:rFonts w:ascii="Calibri" w:eastAsia="Calibri" w:hAnsi="Calibri" w:cs="Calibri"/>
+              </w:rPr>
+            </w:pPr>
+          </w:p>
+        </w:tc>
+        <w:tc>
+          <w:tcPr>
+            <w:tcW w:w="2410" w:type="dxa"/>
           </w:tcPr>
           <w:p>
             <w:pPr>
@@ -1477,48 +1569,40 @@
         <w:tc>
           <w:tcPr>
             <w:tcW w:w="562" w:type="dxa"/>
-            <w:tcBorders>
-              <w:top w:val="nil"/>
-              <w:left w:val="single" w:sz="4" w:space="0" w:color="000000"/>
-              <w:bottom w:val="nil"/>
-              <w:right w:val="single" w:sz="4" w:space="0" w:color="000000"/>
-            </w:tcBorders>
-          </w:tcPr>
-          <w:p>
-            <w:pPr>
-              <w:spacing w:before="60" w:after="60"/>
-              <w:ind w:left="29"/>
-              <w:rPr>
-                <w:rFonts w:ascii="Calibri" w:eastAsia="Calibri" w:hAnsi="Calibri" w:cs="Calibri"/>
-              </w:rPr>
-            </w:pPr>
-          </w:p>
-        </w:tc>
-        <w:tc>
-          <w:tcPr>
-            <w:tcW w:w="2835" w:type="dxa"/>
-            <w:tcBorders>
-              <w:left w:val="single" w:sz="4" w:space="0" w:color="000000"/>
-            </w:tcBorders>
           </w:tcPr>
           <w:p>
             <w:pPr>
               <w:numPr>
                 <w:ilvl w:val="0"/>
-                <w:numId w:val="1"/>
+                <w:numId w:val="2"/>
               </w:numPr>
               <w:spacing w:before="60" w:after="60"/>
-              <w:ind w:left="313"/>
-              <w:rPr>
-                <w:rFonts w:ascii="Calibri" w:eastAsia="Calibri" w:hAnsi="Calibri" w:cs="Calibri"/>
-              </w:rPr>
-            </w:pPr>
-            <w:r>
-              <w:rPr>
-                <w:rFonts w:ascii="Calibri" w:eastAsia="Calibri" w:hAnsi="Calibri" w:cs="Calibri"/>
-              </w:rPr>
-              <w:t>Lembar 1</w:t>
-            </w:r>
+              <w:ind w:left="457"/>
+              <w:rPr>
+                <w:rFonts w:ascii="Calibri" w:eastAsia="Calibri" w:hAnsi="Calibri" w:cs="Calibri"/>
+              </w:rPr>
+            </w:pPr>
+          </w:p>
+        </w:tc>
+        <w:tc>
+          <w:tcPr>
+            <w:tcW w:w="2835" w:type="dxa"/>
+          </w:tcPr>
+          <w:p>
+            <w:pPr>
+              <w:spacing w:before="60"/>
+              <w:rPr>
+                <w:rFonts w:ascii="Calibri" w:eastAsia="Calibri" w:hAnsi="Calibri" w:cs="Calibri"/>
+              </w:rPr>
+            </w:pPr>
+            <w:proofErr w:type="spellStart"/>
+            <w:r>
+              <w:rPr>
+                <w:rFonts w:ascii="Calibri" w:eastAsia="Calibri" w:hAnsi="Calibri" w:cs="Calibri"/>
+              </w:rPr>
+              <w:t>Pembayaran</w:t>
+            </w:r>
+            <w:proofErr w:type="spellEnd"/>
           </w:p>
         </w:tc>
         <w:tc>
@@ -1535,31 +1619,19 @@
         </w:tc>
         <w:tc>
           <w:tcPr>
-            <w:tcW w:w="1461" w:type="dxa"/>
-          </w:tcPr>
-          <w:p>
-            <w:pPr>
-              <w:rPr>
-                <w:rFonts w:ascii="Calibri" w:eastAsia="Calibri" w:hAnsi="Calibri" w:cs="Calibri"/>
-              </w:rPr>
-            </w:pPr>
-          </w:p>
-        </w:tc>
-        <w:tc>
-          <w:tcPr>
-            <w:tcW w:w="1462" w:type="dxa"/>
-          </w:tcPr>
-          <w:p>
-            <w:pPr>
-              <w:rPr>
-                <w:rFonts w:ascii="Calibri" w:eastAsia="Calibri" w:hAnsi="Calibri" w:cs="Calibri"/>
-              </w:rPr>
-            </w:pPr>
-          </w:p>
-        </w:tc>
-        <w:tc>
-          <w:tcPr>
-            <w:tcW w:w="1870" w:type="dxa"/>
+            <w:tcW w:w="2403" w:type="dxa"/>
+          </w:tcPr>
+          <w:p>
+            <w:pPr>
+              <w:rPr>
+                <w:rFonts w:ascii="Calibri" w:eastAsia="Calibri" w:hAnsi="Calibri" w:cs="Calibri"/>
+              </w:rPr>
+            </w:pPr>
+          </w:p>
+        </w:tc>
+        <w:tc>
+          <w:tcPr>
+            <w:tcW w:w="2410" w:type="dxa"/>
           </w:tcPr>
           <w:p>
             <w:pPr>
@@ -1575,47 +1647,70 @@
           <w:tcPr>
             <w:tcW w:w="562" w:type="dxa"/>
             <w:tcBorders>
-              <w:top w:val="nil"/>
-              <w:left w:val="single" w:sz="4" w:space="0" w:color="000000"/>
               <w:bottom w:val="single" w:sz="4" w:space="0" w:color="000000"/>
-              <w:right w:val="single" w:sz="4" w:space="0" w:color="000000"/>
-            </w:tcBorders>
-          </w:tcPr>
-          <w:p>
-            <w:pPr>
-              <w:spacing w:before="60" w:after="60"/>
-              <w:ind w:left="29"/>
-              <w:rPr>
-                <w:rFonts w:ascii="Calibri" w:eastAsia="Calibri" w:hAnsi="Calibri" w:cs="Calibri"/>
-              </w:rPr>
-            </w:pPr>
-          </w:p>
-        </w:tc>
-        <w:tc>
-          <w:tcPr>
-            <w:tcW w:w="2835" w:type="dxa"/>
-            <w:tcBorders>
-              <w:left w:val="single" w:sz="4" w:space="0" w:color="000000"/>
             </w:tcBorders>
           </w:tcPr>
           <w:p>
             <w:pPr>
               <w:numPr>
                 <w:ilvl w:val="0"/>
-                <w:numId w:val="1"/>
+                <w:numId w:val="2"/>
               </w:numPr>
               <w:spacing w:before="60" w:after="60"/>
-              <w:ind w:left="313"/>
-              <w:rPr>
-                <w:rFonts w:ascii="Calibri" w:eastAsia="Calibri" w:hAnsi="Calibri" w:cs="Calibri"/>
-              </w:rPr>
-            </w:pPr>
-            <w:r>
-              <w:rPr>
-                <w:rFonts w:ascii="Calibri" w:eastAsia="Calibri" w:hAnsi="Calibri" w:cs="Calibri"/>
-              </w:rPr>
-              <w:t>Lembar 2</w:t>
-            </w:r>
+              <w:ind w:left="457"/>
+              <w:rPr>
+                <w:rFonts w:ascii="Calibri" w:eastAsia="Calibri" w:hAnsi="Calibri" w:cs="Calibri"/>
+              </w:rPr>
+            </w:pPr>
+          </w:p>
+        </w:tc>
+        <w:tc>
+          <w:tcPr>
+            <w:tcW w:w="2835" w:type="dxa"/>
+          </w:tcPr>
+          <w:p>
+            <w:pPr>
+              <w:spacing w:before="60"/>
+              <w:rPr>
+                <w:rFonts w:ascii="Calibri" w:eastAsia="Calibri" w:hAnsi="Calibri" w:cs="Calibri"/>
+              </w:rPr>
+            </w:pPr>
+            <w:proofErr w:type="spellStart"/>
+            <w:r>
+              <w:rPr>
+                <w:rFonts w:ascii="Calibri" w:eastAsia="Calibri" w:hAnsi="Calibri" w:cs="Calibri"/>
+              </w:rPr>
+              <w:t>Sertifikat</w:t>
+            </w:r>
+            <w:proofErr w:type="spellEnd"/>
+            <w:r>
+              <w:rPr>
+                <w:rFonts w:ascii="Calibri" w:eastAsia="Calibri" w:hAnsi="Calibri" w:cs="Calibri"/>
+              </w:rPr>
+              <w:t xml:space="preserve"> </w:t>
+            </w:r>
+            <w:proofErr w:type="spellStart"/>
+            <w:r>
+              <w:rPr>
+                <w:rFonts w:ascii="Calibri" w:eastAsia="Calibri" w:hAnsi="Calibri" w:cs="Calibri"/>
+              </w:rPr>
+              <w:t>dapat</w:t>
+            </w:r>
+            <w:proofErr w:type="spellEnd"/>
+            <w:r>
+              <w:rPr>
+                <w:rFonts w:ascii="Calibri" w:eastAsia="Calibri" w:hAnsi="Calibri" w:cs="Calibri"/>
+              </w:rPr>
+              <w:t xml:space="preserve"> </w:t>
+            </w:r>
+            <w:proofErr w:type="spellStart"/>
+            <w:r>
+              <w:rPr>
+                <w:rFonts w:ascii="Calibri" w:eastAsia="Calibri" w:hAnsi="Calibri" w:cs="Calibri"/>
+              </w:rPr>
+              <w:t>Diakses</w:t>
+            </w:r>
+            <w:proofErr w:type="spellEnd"/>
           </w:p>
         </w:tc>
         <w:tc>
@@ -1632,31 +1727,19 @@
         </w:tc>
         <w:tc>
           <w:tcPr>
-            <w:tcW w:w="1461" w:type="dxa"/>
-          </w:tcPr>
-          <w:p>
-            <w:pPr>
-              <w:rPr>
-                <w:rFonts w:ascii="Calibri" w:eastAsia="Calibri" w:hAnsi="Calibri" w:cs="Calibri"/>
-              </w:rPr>
-            </w:pPr>
-          </w:p>
-        </w:tc>
-        <w:tc>
-          <w:tcPr>
-            <w:tcW w:w="1462" w:type="dxa"/>
-          </w:tcPr>
-          <w:p>
-            <w:pPr>
-              <w:rPr>
-                <w:rFonts w:ascii="Calibri" w:eastAsia="Calibri" w:hAnsi="Calibri" w:cs="Calibri"/>
-              </w:rPr>
-            </w:pPr>
-          </w:p>
-        </w:tc>
-        <w:tc>
-          <w:tcPr>
-            <w:tcW w:w="1870" w:type="dxa"/>
+            <w:tcW w:w="2403" w:type="dxa"/>
+          </w:tcPr>
+          <w:p>
+            <w:pPr>
+              <w:rPr>
+                <w:rFonts w:ascii="Calibri" w:eastAsia="Calibri" w:hAnsi="Calibri" w:cs="Calibri"/>
+              </w:rPr>
+            </w:pPr>
+          </w:p>
+        </w:tc>
+        <w:tc>
+          <w:tcPr>
+            <w:tcW w:w="2410" w:type="dxa"/>
           </w:tcPr>
           <w:p>
             <w:pPr>
@@ -1760,8 +1843,16 @@
               <w:rPr>
                 <w:rFonts w:ascii="Calibri" w:eastAsia="Calibri" w:hAnsi="Calibri" w:cs="Calibri"/>
               </w:rPr>
-              <w:t>Metode/Instrumen</w:t>
-            </w:r>
+              <w:t>Metode/</w:t>
+            </w:r>
+            <w:proofErr w:type="spellStart"/>
+            <w:r>
+              <w:rPr>
+                <w:rFonts w:ascii="Calibri" w:eastAsia="Calibri" w:hAnsi="Calibri" w:cs="Calibri"/>
+              </w:rPr>
+              <w:t>Instrumen</w:t>
+            </w:r>
+            <w:proofErr w:type="spellEnd"/>
           </w:p>
         </w:tc>
         <w:tc>
@@ -1789,7 +1880,21 @@
               <w:rPr>
                 <w:rFonts w:ascii="Calibri" w:eastAsia="Calibri" w:hAnsi="Calibri" w:cs="Calibri"/>
               </w:rPr>
-              <w:t>&lt;&lt;metode_instrumen&gt;&gt;</w:t>
+              <w:t>&lt;&lt;</w:t>
+            </w:r>
+            <w:proofErr w:type="spellStart"/>
+            <w:r>
+              <w:rPr>
+                <w:rFonts w:ascii="Calibri" w:eastAsia="Calibri" w:hAnsi="Calibri" w:cs="Calibri"/>
+              </w:rPr>
+              <w:t>metode_instrumen</w:t>
+            </w:r>
+            <w:proofErr w:type="spellEnd"/>
+            <w:r>
+              <w:rPr>
+                <w:rFonts w:ascii="Calibri" w:eastAsia="Calibri" w:hAnsi="Calibri" w:cs="Calibri"/>
+              </w:rPr>
+              <w:t>&gt;&gt;</w:t>
             </w:r>
           </w:p>
         </w:tc>
@@ -1842,12 +1947,28 @@
                 <w:rFonts w:ascii="Calibri" w:eastAsia="Calibri" w:hAnsi="Calibri" w:cs="Calibri"/>
               </w:rPr>
             </w:pPr>
-            <w:r>
-              <w:rPr>
-                <w:rFonts w:ascii="Calibri" w:eastAsia="Calibri" w:hAnsi="Calibri" w:cs="Calibri"/>
-              </w:rPr>
-              <w:t>Jumlah sampel</w:t>
-            </w:r>
+            <w:proofErr w:type="spellStart"/>
+            <w:r>
+              <w:rPr>
+                <w:rFonts w:ascii="Calibri" w:eastAsia="Calibri" w:hAnsi="Calibri" w:cs="Calibri"/>
+              </w:rPr>
+              <w:t>Jumlah</w:t>
+            </w:r>
+            <w:proofErr w:type="spellEnd"/>
+            <w:r>
+              <w:rPr>
+                <w:rFonts w:ascii="Calibri" w:eastAsia="Calibri" w:hAnsi="Calibri" w:cs="Calibri"/>
+              </w:rPr>
+              <w:t xml:space="preserve"> </w:t>
+            </w:r>
+            <w:proofErr w:type="spellStart"/>
+            <w:r>
+              <w:rPr>
+                <w:rFonts w:ascii="Calibri" w:eastAsia="Calibri" w:hAnsi="Calibri" w:cs="Calibri"/>
+              </w:rPr>
+              <w:t>sampel</w:t>
+            </w:r>
+            <w:proofErr w:type="spellEnd"/>
           </w:p>
         </w:tc>
         <w:tc>
@@ -1875,7 +1996,21 @@
               <w:rPr>
                 <w:rFonts w:ascii="Calibri" w:eastAsia="Calibri" w:hAnsi="Calibri" w:cs="Calibri"/>
               </w:rPr>
-              <w:t>&lt;&lt;jumlah_sampel_contoh_uji&gt;&gt;</w:t>
+              <w:t>&lt;&lt;</w:t>
+            </w:r>
+            <w:proofErr w:type="spellStart"/>
+            <w:r>
+              <w:rPr>
+                <w:rFonts w:ascii="Calibri" w:eastAsia="Calibri" w:hAnsi="Calibri" w:cs="Calibri"/>
+              </w:rPr>
+              <w:t>jumlah_sampel_contoh_uji</w:t>
+            </w:r>
+            <w:proofErr w:type="spellEnd"/>
+            <w:r>
+              <w:rPr>
+                <w:rFonts w:ascii="Calibri" w:eastAsia="Calibri" w:hAnsi="Calibri" w:cs="Calibri"/>
+              </w:rPr>
+              <w:t>&gt;&gt;</w:t>
             </w:r>
           </w:p>
         </w:tc>
@@ -1928,12 +2063,28 @@
                 <w:rFonts w:ascii="Calibri" w:eastAsia="Calibri" w:hAnsi="Calibri" w:cs="Calibri"/>
               </w:rPr>
             </w:pPr>
-            <w:r>
-              <w:rPr>
-                <w:rFonts w:ascii="Calibri" w:eastAsia="Calibri" w:hAnsi="Calibri" w:cs="Calibri"/>
-              </w:rPr>
-              <w:t>Jumlah Pengukuran</w:t>
-            </w:r>
+            <w:proofErr w:type="spellStart"/>
+            <w:r>
+              <w:rPr>
+                <w:rFonts w:ascii="Calibri" w:eastAsia="Calibri" w:hAnsi="Calibri" w:cs="Calibri"/>
+              </w:rPr>
+              <w:t>Jumlah</w:t>
+            </w:r>
+            <w:proofErr w:type="spellEnd"/>
+            <w:r>
+              <w:rPr>
+                <w:rFonts w:ascii="Calibri" w:eastAsia="Calibri" w:hAnsi="Calibri" w:cs="Calibri"/>
+              </w:rPr>
+              <w:t xml:space="preserve"> </w:t>
+            </w:r>
+            <w:proofErr w:type="spellStart"/>
+            <w:r>
+              <w:rPr>
+                <w:rFonts w:ascii="Calibri" w:eastAsia="Calibri" w:hAnsi="Calibri" w:cs="Calibri"/>
+              </w:rPr>
+              <w:t>Pengukuran</w:t>
+            </w:r>
+            <w:proofErr w:type="spellEnd"/>
           </w:p>
         </w:tc>
         <w:tc>
@@ -1978,7 +2129,21 @@
               <w:rPr>
                 <w:rFonts w:ascii="Calibri" w:eastAsia="Calibri" w:hAnsi="Calibri" w:cs="Calibri"/>
               </w:rPr>
-              <w:t xml:space="preserve">&lt;&lt;pengukuran_pengulangan_per_sampel&gt;&gt;</w:t>
+              <w:t>&lt;&lt;</w:t>
+            </w:r>
+            <w:proofErr w:type="spellStart"/>
+            <w:r>
+              <w:rPr>
+                <w:rFonts w:ascii="Calibri" w:eastAsia="Calibri" w:hAnsi="Calibri" w:cs="Calibri"/>
+              </w:rPr>
+              <w:t>pengukuran_pengulangan_per_sampel</w:t>
+            </w:r>
+            <w:proofErr w:type="spellEnd"/>
+            <w:r>
+              <w:rPr>
+                <w:rFonts w:ascii="Calibri" w:eastAsia="Calibri" w:hAnsi="Calibri" w:cs="Calibri"/>
+              </w:rPr>
+              <w:t>&gt;&gt;</w:t>
             </w:r>
           </w:p>
         </w:tc>
@@ -2045,7 +2210,7 @@
 </file>
 
 <file path=word/numbering.xml><?xml version="1.0" encoding="utf-8"?>
-<w:numbering xmlns:wpc="http://schemas.microsoft.com/office/word/2010/wordprocessingCanvas" xmlns:cx="http://schemas.microsoft.com/office/drawing/2014/chartex" xmlns:cx1="http://schemas.microsoft.com/office/drawing/2015/9/8/chartex" xmlns:cx2="http://schemas.microsoft.com/office/drawing/2015/10/21/chartex" xmlns:cx3="http://schemas.microsoft.com/office/drawing/2016/5/9/chartex" xmlns:cx4="http://schemas.microsoft.com/office/drawing/2016/5/10/chartex" xmlns:cx5="http://schemas.microsoft.com/office/drawing/2016/5/11/chartex" xmlns:cx6="http://schemas.microsoft.com/office/drawing/2016/5/12/chartex" xmlns:cx7="http://schemas.microsoft.com/office/drawing/2016/5/13/chartex" xmlns:cx8="http://schemas.microsoft.com/office/drawing/2016/5/14/chartex" xmlns:mc="http://schemas.openxmlformats.org/markup-compatibility/2006" xmlns:aink="http://schemas.microsoft.com/office/drawing/2016/ink" xmlns:am3d="http://schemas.microsoft.com/office/drawing/2017/model3d" xmlns:o="urn:schemas-microsoft-com:office:office" xmlns:oel="http://schemas.microsoft.com/office/2019/extlst" xmlns:r="http://schemas.openxmlformats.org/officeDocument/2006/relationships" xmlns:m="http://schemas.openxmlformats.org/officeDocument/2006/math" xmlns:v="urn:schemas-microsoft-com:vml" xmlns:wp14="http://schemas.microsoft.com/office/word/2010/wordprocessingDrawing" xmlns:wp="http://schemas.openxmlformats.org/drawingml/2006/wordprocessingDrawing" xmlns:w10="urn:schemas-microsoft-com:office:word" xmlns:w="http://schemas.openxmlformats.org/wordprocessingml/2006/main" xmlns:w14="http://schemas.microsoft.com/office/word/2010/wordml" xmlns:w15="http://schemas.microsoft.com/office/word/2012/wordml" xmlns:w16cei="http://schemas.microsoft.com/office/word/2026/wordml/cei" xmlns:w16cex="http://schemas.microsoft.com/office/word/2018/wordml/cex" xmlns:w16cid="http://schemas.microsoft.com/office/word/2016/wordml/cid" xmlns:w16="http://schemas.microsoft.com/office/word/2018/wordml" xmlns:w16du="http://schemas.microsoft.com/office/word/2023/wordml/word16du" xmlns:w16sdtdh="http://schemas.microsoft.com/office/word/2020/wordml/sdtdatahash" xmlns:w16sdtfl="http://schemas.microsoft.com/office/word/2024/wordml/sdtformatlock" xmlns:w16se="http://schemas.microsoft.com/office/word/2015/wordml/symex" xmlns:wpg="http://schemas.microsoft.com/office/word/2010/wordprocessingGroup" xmlns:wpi="http://schemas.microsoft.com/office/word/2010/wordprocessingInk" xmlns:wne="http://schemas.microsoft.com/office/word/2006/wordml" xmlns:wps="http://schemas.microsoft.com/office/word/2010/wordprocessingShape" mc:Ignorable="w14 w15 w16se w16cid w16 w16cex w16sdtdh w16sdtfl w16du wp14">
+<w:numbering xmlns:wpc="http://schemas.microsoft.com/office/word/2010/wordprocessingCanvas" xmlns:cx="http://schemas.microsoft.com/office/drawing/2014/chartex" xmlns:cx1="http://schemas.microsoft.com/office/drawing/2015/9/8/chartex" xmlns:cx2="http://schemas.microsoft.com/office/drawing/2015/10/21/chartex" xmlns:cx3="http://schemas.microsoft.com/office/drawing/2016/5/9/chartex" xmlns:cx4="http://schemas.microsoft.com/office/drawing/2016/5/10/chartex" xmlns:cx5="http://schemas.microsoft.com/office/drawing/2016/5/11/chartex" xmlns:cx6="http://schemas.microsoft.com/office/drawing/2016/5/12/chartex" xmlns:cx7="http://schemas.microsoft.com/office/drawing/2016/5/13/chartex" xmlns:cx8="http://schemas.microsoft.com/office/drawing/2016/5/14/chartex" xmlns:mc="http://schemas.openxmlformats.org/markup-compatibility/2006" xmlns:aink="http://schemas.microsoft.com/office/drawing/2016/ink" xmlns:am3d="http://schemas.microsoft.com/office/drawing/2017/model3d" xmlns:o="urn:schemas-microsoft-com:office:office" xmlns:oel="http://schemas.microsoft.com/office/2019/extlst" xmlns:r="http://schemas.openxmlformats.org/officeDocument/2006/relationships" xmlns:m="http://schemas.openxmlformats.org/officeDocument/2006/math" xmlns:v="urn:schemas-microsoft-com:vml" xmlns:wp14="http://schemas.microsoft.com/office/word/2010/wordprocessingDrawing" xmlns:wp="http://schemas.openxmlformats.org/drawingml/2006/wordprocessingDrawing" xmlns:w10="urn:schemas-microsoft-com:office:word" xmlns:w="http://schemas.openxmlformats.org/wordprocessingml/2006/main" xmlns:w14="http://schemas.microsoft.com/office/word/2010/wordml" xmlns:w15="http://schemas.microsoft.com/office/word/2012/wordml" xmlns:w16cex="http://schemas.microsoft.com/office/word/2018/wordml/cex" xmlns:w16cid="http://schemas.microsoft.com/office/word/2016/wordml/cid" xmlns:w16="http://schemas.microsoft.com/office/word/2018/wordml" xmlns:w16du="http://schemas.microsoft.com/office/word/2023/wordml/word16du" xmlns:w16sdtdh="http://schemas.microsoft.com/office/word/2020/wordml/sdtdatahash" xmlns:w16sdtfl="http://schemas.microsoft.com/office/word/2024/wordml/sdtformatlock" xmlns:w16se="http://schemas.microsoft.com/office/word/2015/wordml/symex" xmlns:wpg="http://schemas.microsoft.com/office/word/2010/wordprocessingGroup" xmlns:wpi="http://schemas.microsoft.com/office/word/2010/wordprocessingInk" xmlns:wne="http://schemas.microsoft.com/office/word/2006/wordml" xmlns:wps="http://schemas.microsoft.com/office/word/2010/wordprocessingShape" mc:Ignorable="w14 w15 w16se w16cid w16 w16cex w16sdtdh w16sdtfl w16du wp14">
   <w:abstractNum w:abstractNumId="0" w15:restartNumberingAfterBreak="0">
     <w:nsid w:val="149A1409"/>
     <w:multiLevelType w:val="multilevel"/>

</xml_diff>

<commit_message>
feat: superadmin override, admin revisi status, and performance fixes
- VerificationController: superadmin bypass for all role checks, log actions with (override superadmin) suffix
- Add admin_revisi status migration for berita_acaras
- CostCalculationService: eliminate N+1 queries for instrument prices and form fields
- PdfGeneratorService: cache form fields, eager-load relations, reuse verify logs
- PdfTemplateController: new template variables (prodi/fakultas, dosen pembimbing, email, alamat, status pelanggan, metode instrumen), prefer assigned petugas over superadmin verifier
- FormTemplateSeeder: lock BA fields, add Status pelanggan field
- Frontend: role-aware Navbar/Sidebar, authStore enhancements, PerhitunganBiaya improvements, berita acara detail UI
- Add sample berita acara draft files
</commit_message>
<xml_diff>
--- a/backend/file/Lembar kendali sampel.docx
+++ b/backend/file/Lembar kendali sampel.docx
@@ -461,7 +461,7 @@
               </wp:anchor>
             </w:drawing>
           </mc:Choice>
-          <mc:Fallback xmlns:cr="http://schemas.microsoft.com/office/comments/2020/reactions" xmlns="http://schemas.microsoft.com/office/tasks/2019/documenttasks" xmlns:dgm="http://schemas.openxmlformats.org/drawingml/2006/diagram" xmlns:lc="http://schemas.openxmlformats.org/drawingml/2006/lockedCanvas" xmlns:c="http://schemas.openxmlformats.org/drawingml/2006/chart" xmlns:pic="http://schemas.openxmlformats.org/drawingml/2006/picture" xmlns:a="http://schemas.openxmlformats.org/drawingml/2006/main" xmlns:sl="http://schemas.openxmlformats.org/schemaLibrary/2006/main" xmlns:w16cei="http://schemas.microsoft.com/office/word/2026/wordml/cei">
+          <mc:Fallback xmlns:w16cei="http://schemas.microsoft.com/office/word/2026/wordml/cei" xmlns:sl="http://schemas.openxmlformats.org/schemaLibrary/2006/main" xmlns:a="http://schemas.openxmlformats.org/drawingml/2006/main" xmlns:pic="http://schemas.openxmlformats.org/drawingml/2006/picture" xmlns:c="http://schemas.openxmlformats.org/drawingml/2006/chart" xmlns:lc="http://schemas.openxmlformats.org/drawingml/2006/lockedCanvas" xmlns:dgm="http://schemas.openxmlformats.org/drawingml/2006/diagram" xmlns="http://schemas.microsoft.com/office/tasks/2019/documenttasks" xmlns:cr="http://schemas.microsoft.com/office/comments/2020/reactions">
             <w:drawing>
               <wp:anchor allowOverlap="1" behindDoc="0" distB="0" distT="0" distL="114300" distR="114300" hidden="0" layoutInCell="1" locked="0" relativeHeight="0" simplePos="0">
                 <wp:simplePos x="0" y="0"/>
@@ -989,6 +989,34 @@
                 <w:rFonts w:ascii="Calibri" w:eastAsia="Calibri" w:hAnsi="Calibri" w:cs="Calibri"/>
               </w:rPr>
             </w:pPr>
+            <w:r>
+              <w:rPr>
+                <w:rFonts w:ascii="Calibri" w:eastAsia="Calibri" w:hAnsi="Calibri" w:cs="Calibri"/>
+              </w:rPr>
+              <w:t xml:space="preserve">&lt;&lt;tanggal_berita_acara&gt;&gt;</w:t>
+            </w:r>
+            <w:proofErr w:type="spellStart"/>
+            <w:r>
+              <w:rPr>
+                <w:rFonts w:ascii="Calibri" w:eastAsia="Calibri" w:hAnsi="Calibri" w:cs="Calibri"/>
+              </w:rPr>
+              <w:t xml:space="preserve"/>
+            </w:r>
+            <w:proofErr w:type="spellEnd"/>
+            <w:r>
+              <w:rPr>
+                <w:rFonts w:ascii="Calibri" w:eastAsia="Calibri" w:hAnsi="Calibri" w:cs="Calibri"/>
+              </w:rPr>
+              <w:t xml:space="preserve"/>
+            </w:r>
+            <w:proofErr w:type="spellStart"/>
+            <w:r>
+              <w:rPr>
+                <w:rFonts w:ascii="Calibri" w:eastAsia="Calibri" w:hAnsi="Calibri" w:cs="Calibri"/>
+              </w:rPr>
+              <w:t xml:space="preserve"/>
+            </w:r>
+            <w:proofErr w:type="spellEnd"/>
           </w:p>
         </w:tc>
         <w:tc>
@@ -1001,6 +1029,12 @@
                 <w:rFonts w:ascii="Calibri" w:eastAsia="Calibri" w:hAnsi="Calibri" w:cs="Calibri"/>
               </w:rPr>
             </w:pPr>
+            <w:r>
+              <w:rPr>
+                <w:rFonts w:ascii="Calibri" w:eastAsia="Calibri" w:hAnsi="Calibri" w:cs="Calibri"/>
+              </w:rPr>
+              <w:t xml:space="preserve">&lt;&lt;nama_admin&gt;&gt;</w:t>
+            </w:r>
           </w:p>
         </w:tc>
         <w:tc>
@@ -1013,6 +1047,12 @@
                 <w:rFonts w:ascii="Calibri" w:eastAsia="Calibri" w:hAnsi="Calibri" w:cs="Calibri"/>
               </w:rPr>
             </w:pPr>
+            <w:r>
+              <w:rPr>
+                <w:rFonts w:ascii="Calibri" w:eastAsia="Calibri" w:hAnsi="Calibri" w:cs="Calibri"/>
+              </w:rPr>
+              <w:t xml:space="preserve">Admin</w:t>
+            </w:r>
           </w:p>
         </w:tc>
       </w:tr>
@@ -1080,6 +1120,20 @@
                 <w:rFonts w:ascii="Calibri" w:eastAsia="Calibri" w:hAnsi="Calibri" w:cs="Calibri"/>
               </w:rPr>
             </w:pPr>
+            <w:r>
+              <w:rPr>
+                <w:rFonts w:ascii="Calibri" w:eastAsia="Calibri" w:hAnsi="Calibri" w:cs="Calibri"/>
+              </w:rPr>
+              <w:t xml:space="preserve">&lt;&lt;tanggal_penerimaan_sampel&gt;&gt;</w:t>
+            </w:r>
+            <w:proofErr w:type="spellStart"/>
+            <w:r>
+              <w:rPr>
+                <w:rFonts w:ascii="Calibri" w:eastAsia="Calibri" w:hAnsi="Calibri" w:cs="Calibri"/>
+              </w:rPr>
+              <w:t xml:space="preserve"/>
+            </w:r>
+            <w:proofErr w:type="spellEnd"/>
           </w:p>
         </w:tc>
         <w:tc>
@@ -1092,6 +1146,12 @@
                 <w:rFonts w:ascii="Calibri" w:eastAsia="Calibri" w:hAnsi="Calibri" w:cs="Calibri"/>
               </w:rPr>
             </w:pPr>
+            <w:r>
+              <w:rPr>
+                <w:rFonts w:ascii="Calibri" w:eastAsia="Calibri" w:hAnsi="Calibri" w:cs="Calibri"/>
+              </w:rPr>
+              <w:t xml:space="preserve">&lt;&lt;nama_admin&gt;&gt;</w:t>
+            </w:r>
           </w:p>
         </w:tc>
         <w:tc>
@@ -1104,6 +1164,12 @@
                 <w:rFonts w:ascii="Calibri" w:eastAsia="Calibri" w:hAnsi="Calibri" w:cs="Calibri"/>
               </w:rPr>
             </w:pPr>
+            <w:r>
+              <w:rPr>
+                <w:rFonts w:ascii="Calibri" w:eastAsia="Calibri" w:hAnsi="Calibri" w:cs="Calibri"/>
+              </w:rPr>
+              <w:t xml:space="preserve">Admin</w:t>
+            </w:r>
           </w:p>
         </w:tc>
       </w:tr>
@@ -1132,33 +1198,31 @@
           </w:tcPr>
           <w:p>
             <w:pPr>
-              <w:spacing w:before="60" w:after="120"/>
-              <w:rPr>
-                <w:rFonts w:ascii="Calibri" w:eastAsia="Calibri" w:hAnsi="Calibri" w:cs="Calibri"/>
-              </w:rPr>
-            </w:pPr>
-            <w:proofErr w:type="spellStart"/>
-            <w:r>
-              <w:rPr>
-                <w:rFonts w:ascii="Calibri" w:eastAsia="Calibri" w:hAnsi="Calibri" w:cs="Calibri"/>
-              </w:rPr>
-              <w:t>Verifikasi</w:t>
-            </w:r>
-            <w:proofErr w:type="spellEnd"/>
-            <w:r>
-              <w:rPr>
-                <w:rFonts w:ascii="Calibri" w:eastAsia="Calibri" w:hAnsi="Calibri" w:cs="Calibri"/>
-              </w:rPr>
-              <w:t xml:space="preserve"> </w:t>
-            </w:r>
-            <w:proofErr w:type="spellStart"/>
-            <w:r>
-              <w:rPr>
-                <w:rFonts w:ascii="Calibri" w:eastAsia="Calibri" w:hAnsi="Calibri" w:cs="Calibri"/>
-              </w:rPr>
-              <w:t>Penyelia</w:t>
-            </w:r>
-            <w:proofErr w:type="spellEnd"/>
+              <w:spacing w:before="60" w:after="60"/>
+              <w:rPr>
+                <w:rFonts w:ascii="Calibri" w:eastAsia="Calibri" w:hAnsi="Calibri" w:cs="Calibri"/>
+              </w:rPr>
+            </w:pPr>
+            <w:r>
+              <w:rPr>
+                <w:rFonts w:ascii="Calibri" w:eastAsia="Calibri" w:hAnsi="Calibri" w:cs="Calibri"/>
+              </w:rPr>
+              <w:t xml:space="preserve">Sample </w:t>
+            </w:r>
+            <w:proofErr w:type="spellStart"/>
+            <w:r>
+              <w:rPr>
+                <w:rFonts w:ascii="Calibri" w:eastAsia="Calibri" w:hAnsi="Calibri" w:cs="Calibri"/>
+              </w:rPr>
+              <w:t>diterima</w:t>
+            </w:r>
+            <w:proofErr w:type="spellEnd"/>
+            <w:r>
+              <w:rPr>
+                <w:rFonts w:ascii="Calibri" w:eastAsia="Calibri" w:hAnsi="Calibri" w:cs="Calibri"/>
+              </w:rPr>
+              <w:t xml:space="preserve"> Analis</w:t>
+            </w:r>
           </w:p>
         </w:tc>
         <w:tc>
@@ -1171,6 +1235,34 @@
                 <w:rFonts w:ascii="Calibri" w:eastAsia="Calibri" w:hAnsi="Calibri" w:cs="Calibri"/>
               </w:rPr>
             </w:pPr>
+            <w:r>
+              <w:rPr>
+                <w:rFonts w:ascii="Calibri" w:eastAsia="Calibri" w:hAnsi="Calibri" w:cs="Calibri"/>
+              </w:rPr>
+              <w:t xml:space="preserve">&lt;&lt;tanggal_verifikasi_penyelia&gt;&gt;</w:t>
+            </w:r>
+            <w:proofErr w:type="spellStart"/>
+            <w:r>
+              <w:rPr>
+                <w:rFonts w:ascii="Calibri" w:eastAsia="Calibri" w:hAnsi="Calibri" w:cs="Calibri"/>
+              </w:rPr>
+              <w:t xml:space="preserve"/>
+            </w:r>
+            <w:proofErr w:type="spellEnd"/>
+            <w:r>
+              <w:rPr>
+                <w:rFonts w:ascii="Calibri" w:eastAsia="Calibri" w:hAnsi="Calibri" w:cs="Calibri"/>
+              </w:rPr>
+              <w:t xml:space="preserve"/>
+            </w:r>
+            <w:proofErr w:type="spellStart"/>
+            <w:r>
+              <w:rPr>
+                <w:rFonts w:ascii="Calibri" w:eastAsia="Calibri" w:hAnsi="Calibri" w:cs="Calibri"/>
+              </w:rPr>
+              <w:t xml:space="preserve"/>
+            </w:r>
+            <w:proofErr w:type="spellEnd"/>
           </w:p>
         </w:tc>
         <w:tc>
@@ -1183,6 +1275,12 @@
                 <w:rFonts w:ascii="Calibri" w:eastAsia="Calibri" w:hAnsi="Calibri" w:cs="Calibri"/>
               </w:rPr>
             </w:pPr>
+            <w:r>
+              <w:rPr>
+                <w:rFonts w:ascii="Calibri" w:eastAsia="Calibri" w:hAnsi="Calibri" w:cs="Calibri"/>
+              </w:rPr>
+              <w:t xml:space="preserve">&lt;&lt;nama_analyst&gt;&gt;</w:t>
+            </w:r>
           </w:p>
         </w:tc>
         <w:tc>
@@ -1195,6 +1293,12 @@
                 <w:rFonts w:ascii="Calibri" w:eastAsia="Calibri" w:hAnsi="Calibri" w:cs="Calibri"/>
               </w:rPr>
             </w:pPr>
+            <w:r>
+              <w:rPr>
+                <w:rFonts w:ascii="Calibri" w:eastAsia="Calibri" w:hAnsi="Calibri" w:cs="Calibri"/>
+              </w:rPr>
+              <w:t xml:space="preserve">Analis</w:t>
+            </w:r>
           </w:p>
         </w:tc>
       </w:tr>
@@ -1223,24 +1327,39 @@
           </w:tcPr>
           <w:p>
             <w:pPr>
-              <w:spacing w:before="60" w:after="60"/>
-              <w:rPr>
-                <w:rFonts w:ascii="Calibri" w:eastAsia="Calibri" w:hAnsi="Calibri" w:cs="Calibri"/>
-              </w:rPr>
-            </w:pPr>
-            <w:proofErr w:type="spellStart"/>
-            <w:r>
-              <w:rPr>
-                <w:rFonts w:ascii="Calibri" w:eastAsia="Calibri" w:hAnsi="Calibri" w:cs="Calibri"/>
-              </w:rPr>
-              <w:t>Pembagian</w:t>
-            </w:r>
-            <w:proofErr w:type="spellEnd"/>
-            <w:r>
-              <w:rPr>
-                <w:rFonts w:ascii="Calibri" w:eastAsia="Calibri" w:hAnsi="Calibri" w:cs="Calibri"/>
-              </w:rPr>
-              <w:t xml:space="preserve"> Analis</w:t>
+              <w:spacing w:before="60"/>
+              <w:rPr>
+                <w:rFonts w:ascii="Calibri" w:eastAsia="Calibri" w:hAnsi="Calibri" w:cs="Calibri"/>
+                <w:lang w:val="fi-FI"/>
+              </w:rPr>
+            </w:pPr>
+            <w:r>
+              <w:rPr>
+                <w:rFonts w:ascii="Calibri" w:eastAsia="Calibri" w:hAnsi="Calibri" w:cs="Calibri"/>
+                <w:lang w:val="fi-FI"/>
+              </w:rPr>
+              <w:t>Draft hasil</w:t>
+            </w:r>
+            <w:r>
+              <w:rPr>
+                <w:rFonts w:ascii="Calibri" w:eastAsia="Calibri" w:hAnsi="Calibri" w:cs="Calibri"/>
+                <w:lang w:val="fi-FI"/>
+              </w:rPr>
+              <w:t xml:space="preserve"> diserahkan</w:t>
+            </w:r>
+            <w:r>
+              <w:rPr>
+                <w:rFonts w:ascii="Calibri" w:eastAsia="Calibri" w:hAnsi="Calibri" w:cs="Calibri"/>
+                <w:lang w:val="fi-FI"/>
+              </w:rPr>
+              <w:t xml:space="preserve"> Anali</w:t>
+            </w:r>
+            <w:r>
+              <w:rPr>
+                <w:rFonts w:ascii="Calibri" w:eastAsia="Calibri" w:hAnsi="Calibri" w:cs="Calibri"/>
+                <w:lang w:val="fi-FI"/>
+              </w:rPr>
+              <w:t>s</w:t>
             </w:r>
           </w:p>
         </w:tc>
@@ -1252,8 +1371,16 @@
             <w:pPr>
               <w:rPr>
                 <w:rFonts w:ascii="Calibri" w:eastAsia="Calibri" w:hAnsi="Calibri" w:cs="Calibri"/>
-              </w:rPr>
-            </w:pPr>
+                <w:lang w:val="fi-FI"/>
+              </w:rPr>
+            </w:pPr>
+            <w:r>
+              <w:rPr>
+                <w:rFonts w:ascii="Calibri" w:eastAsia="Calibri" w:hAnsi="Calibri" w:cs="Calibri"/>
+                <w:lang w:val="fi-FI"/>
+              </w:rPr>
+              <w:t xml:space="preserve">&lt;&lt;tanggal_rekap_analis&gt;&gt;</w:t>
+            </w:r>
           </w:p>
         </w:tc>
         <w:tc>
@@ -1264,8 +1391,15 @@
             <w:pPr>
               <w:rPr>
                 <w:rFonts w:ascii="Calibri" w:eastAsia="Calibri" w:hAnsi="Calibri" w:cs="Calibri"/>
-              </w:rPr>
-            </w:pPr>
+                <w:lang w:val="fi-FI"/>
+              </w:rPr>
+            </w:pPr>
+            <w:r>
+              <w:rPr>
+                <w:rFonts w:ascii="Calibri" w:eastAsia="Calibri" w:hAnsi="Calibri" w:cs="Calibri"/>
+              </w:rPr>
+              <w:t xml:space="preserve">&lt;&lt;nama_analyst&gt;&gt;</w:t>
+            </w:r>
           </w:p>
         </w:tc>
         <w:tc>
@@ -1276,8 +1410,15 @@
             <w:pPr>
               <w:rPr>
                 <w:rFonts w:ascii="Calibri" w:eastAsia="Calibri" w:hAnsi="Calibri" w:cs="Calibri"/>
-              </w:rPr>
-            </w:pPr>
+                <w:lang w:val="fi-FI"/>
+              </w:rPr>
+            </w:pPr>
+            <w:r>
+              <w:rPr>
+                <w:rFonts w:ascii="Calibri" w:eastAsia="Calibri" w:hAnsi="Calibri" w:cs="Calibri"/>
+              </w:rPr>
+              <w:t xml:space="preserve">Analis</w:t>
+            </w:r>
           </w:p>
         </w:tc>
       </w:tr>
@@ -1296,6 +1437,7 @@
               <w:ind w:left="457"/>
               <w:rPr>
                 <w:rFonts w:ascii="Calibri" w:eastAsia="Calibri" w:hAnsi="Calibri" w:cs="Calibri"/>
+                <w:lang w:val="fi-FI"/>
               </w:rPr>
             </w:pPr>
           </w:p>
@@ -1309,37 +1451,30 @@
               <w:spacing w:before="60"/>
               <w:rPr>
                 <w:rFonts w:ascii="Calibri" w:eastAsia="Calibri" w:hAnsi="Calibri" w:cs="Calibri"/>
-                <w:lang w:val="fi-FI"/>
-              </w:rPr>
-            </w:pPr>
-            <w:r>
-              <w:rPr>
-                <w:rFonts w:ascii="Calibri" w:eastAsia="Calibri" w:hAnsi="Calibri" w:cs="Calibri"/>
-                <w:lang w:val="fi-FI"/>
-              </w:rPr>
-              <w:t>Draft hasil</w:t>
-            </w:r>
-            <w:r>
-              <w:rPr>
-                <w:rFonts w:ascii="Calibri" w:eastAsia="Calibri" w:hAnsi="Calibri" w:cs="Calibri"/>
-                <w:lang w:val="fi-FI"/>
-              </w:rPr>
-              <w:t xml:space="preserve"> diserahkan</w:t>
-            </w:r>
-            <w:r>
-              <w:rPr>
-                <w:rFonts w:ascii="Calibri" w:eastAsia="Calibri" w:hAnsi="Calibri" w:cs="Calibri"/>
-                <w:lang w:val="fi-FI"/>
-              </w:rPr>
-              <w:t xml:space="preserve"> Anali</w:t>
-            </w:r>
-            <w:r>
-              <w:rPr>
-                <w:rFonts w:ascii="Calibri" w:eastAsia="Calibri" w:hAnsi="Calibri" w:cs="Calibri"/>
-                <w:lang w:val="fi-FI"/>
-              </w:rPr>
-              <w:t>s</w:t>
-            </w:r>
+              </w:rPr>
+            </w:pPr>
+            <w:proofErr w:type="spellStart"/>
+            <w:r>
+              <w:rPr>
+                <w:rFonts w:ascii="Calibri" w:eastAsia="Calibri" w:hAnsi="Calibri" w:cs="Calibri"/>
+              </w:rPr>
+              <w:t>Pemeriksaan</w:t>
+            </w:r>
+            <w:proofErr w:type="spellEnd"/>
+            <w:r>
+              <w:rPr>
+                <w:rFonts w:ascii="Calibri" w:eastAsia="Calibri" w:hAnsi="Calibri" w:cs="Calibri"/>
+              </w:rPr>
+              <w:t xml:space="preserve"> draft </w:t>
+            </w:r>
+            <w:proofErr w:type="spellStart"/>
+            <w:r>
+              <w:rPr>
+                <w:rFonts w:ascii="Calibri" w:eastAsia="Calibri" w:hAnsi="Calibri" w:cs="Calibri"/>
+              </w:rPr>
+              <w:t>hasil</w:t>
+            </w:r>
+            <w:proofErr w:type="spellEnd"/>
           </w:p>
         </w:tc>
         <w:tc>
@@ -1350,9 +1485,28 @@
             <w:pPr>
               <w:rPr>
                 <w:rFonts w:ascii="Calibri" w:eastAsia="Calibri" w:hAnsi="Calibri" w:cs="Calibri"/>
-                <w:lang w:val="fi-FI"/>
-              </w:rPr>
-            </w:pPr>
+              </w:rPr>
+            </w:pPr>
+            <w:r>
+              <w:rPr>
+                <w:rFonts w:ascii="Calibri" w:eastAsia="Calibri" w:hAnsi="Calibri" w:cs="Calibri"/>
+              </w:rPr>
+              <w:t xml:space="preserve">&lt;&lt;tanggal_verifikasi_manager&gt;&gt;</w:t>
+            </w:r>
+            <w:proofErr w:type="spellStart"/>
+            <w:r>
+              <w:rPr>
+                <w:rFonts w:ascii="Calibri" w:eastAsia="Calibri" w:hAnsi="Calibri" w:cs="Calibri"/>
+              </w:rPr>
+              <w:t xml:space="preserve"/>
+            </w:r>
+            <w:proofErr w:type="spellEnd"/>
+            <w:r>
+              <w:rPr>
+                <w:rFonts w:ascii="Calibri" w:eastAsia="Calibri" w:hAnsi="Calibri" w:cs="Calibri"/>
+              </w:rPr>
+              <w:t xml:space="preserve"/>
+            </w:r>
           </w:p>
         </w:tc>
         <w:tc>
@@ -1363,9 +1517,14 @@
             <w:pPr>
               <w:rPr>
                 <w:rFonts w:ascii="Calibri" w:eastAsia="Calibri" w:hAnsi="Calibri" w:cs="Calibri"/>
-                <w:lang w:val="fi-FI"/>
-              </w:rPr>
-            </w:pPr>
+              </w:rPr>
+            </w:pPr>
+            <w:r>
+              <w:rPr>
+                <w:rFonts w:ascii="Calibri" w:eastAsia="Calibri" w:hAnsi="Calibri" w:cs="Calibri"/>
+              </w:rPr>
+              <w:t xml:space="preserve">&lt;&lt;nama_manager_teknis&gt;&gt;</w:t>
+            </w:r>
           </w:p>
         </w:tc>
         <w:tc>
@@ -1376,9 +1535,14 @@
             <w:pPr>
               <w:rPr>
                 <w:rFonts w:ascii="Calibri" w:eastAsia="Calibri" w:hAnsi="Calibri" w:cs="Calibri"/>
-                <w:lang w:val="fi-FI"/>
-              </w:rPr>
-            </w:pPr>
+              </w:rPr>
+            </w:pPr>
+            <w:r>
+              <w:rPr>
+                <w:rFonts w:ascii="Calibri" w:eastAsia="Calibri" w:hAnsi="Calibri" w:cs="Calibri"/>
+              </w:rPr>
+              <w:t xml:space="preserve">Manager Teknis</w:t>
+            </w:r>
           </w:p>
         </w:tc>
       </w:tr>
@@ -1397,7 +1561,6 @@
               <w:ind w:left="457"/>
               <w:rPr>
                 <w:rFonts w:ascii="Calibri" w:eastAsia="Calibri" w:hAnsi="Calibri" w:cs="Calibri"/>
-                <w:lang w:val="fi-FI"/>
               </w:rPr>
             </w:pPr>
           </w:p>
@@ -1418,21 +1581,7 @@
               <w:rPr>
                 <w:rFonts w:ascii="Calibri" w:eastAsia="Calibri" w:hAnsi="Calibri" w:cs="Calibri"/>
               </w:rPr>
-              <w:t>Pemeriksaan</w:t>
-            </w:r>
-            <w:proofErr w:type="spellEnd"/>
-            <w:r>
-              <w:rPr>
-                <w:rFonts w:ascii="Calibri" w:eastAsia="Calibri" w:hAnsi="Calibri" w:cs="Calibri"/>
-              </w:rPr>
-              <w:t xml:space="preserve"> draft </w:t>
-            </w:r>
-            <w:proofErr w:type="spellStart"/>
-            <w:r>
-              <w:rPr>
-                <w:rFonts w:ascii="Calibri" w:eastAsia="Calibri" w:hAnsi="Calibri" w:cs="Calibri"/>
-              </w:rPr>
-              <w:t>hasil</w:t>
+              <w:t>Pembayaran</w:t>
             </w:r>
             <w:proofErr w:type="spellEnd"/>
           </w:p>
@@ -1447,6 +1596,34 @@
                 <w:rFonts w:ascii="Calibri" w:eastAsia="Calibri" w:hAnsi="Calibri" w:cs="Calibri"/>
               </w:rPr>
             </w:pPr>
+            <w:r>
+              <w:rPr>
+                <w:rFonts w:ascii="Calibri" w:eastAsia="Calibri" w:hAnsi="Calibri" w:cs="Calibri"/>
+              </w:rPr>
+              <w:t xml:space="preserve">&lt;&lt;tanggal_pembayaran&gt;&gt;</w:t>
+            </w:r>
+            <w:proofErr w:type="spellStart"/>
+            <w:r>
+              <w:rPr>
+                <w:rFonts w:ascii="Calibri" w:eastAsia="Calibri" w:hAnsi="Calibri" w:cs="Calibri"/>
+              </w:rPr>
+              <w:t xml:space="preserve"/>
+            </w:r>
+            <w:proofErr w:type="spellEnd"/>
+            <w:r>
+              <w:rPr>
+                <w:rFonts w:ascii="Calibri" w:eastAsia="Calibri" w:hAnsi="Calibri" w:cs="Calibri"/>
+              </w:rPr>
+              <w:t xml:space="preserve"/>
+            </w:r>
+            <w:proofErr w:type="spellStart"/>
+            <w:r>
+              <w:rPr>
+                <w:rFonts w:ascii="Calibri" w:eastAsia="Calibri" w:hAnsi="Calibri" w:cs="Calibri"/>
+              </w:rPr>
+              <w:t xml:space="preserve"/>
+            </w:r>
+            <w:proofErr w:type="spellEnd"/>
           </w:p>
         </w:tc>
         <w:tc>
@@ -1459,6 +1636,12 @@
                 <w:rFonts w:ascii="Calibri" w:eastAsia="Calibri" w:hAnsi="Calibri" w:cs="Calibri"/>
               </w:rPr>
             </w:pPr>
+            <w:r>
+              <w:rPr>
+                <w:rFonts w:ascii="Calibri" w:eastAsia="Calibri" w:hAnsi="Calibri" w:cs="Calibri"/>
+              </w:rPr>
+              <w:t xml:space="preserve">&lt;&lt;nama_bendahara&gt;&gt;</w:t>
+            </w:r>
           </w:p>
         </w:tc>
         <w:tc>
@@ -1471,6 +1654,12 @@
                 <w:rFonts w:ascii="Calibri" w:eastAsia="Calibri" w:hAnsi="Calibri" w:cs="Calibri"/>
               </w:rPr>
             </w:pPr>
+            <w:r>
+              <w:rPr>
+                <w:rFonts w:ascii="Calibri" w:eastAsia="Calibri" w:hAnsi="Calibri" w:cs="Calibri"/>
+              </w:rPr>
+              <w:t xml:space="preserve">Bendahara</w:t>
+            </w:r>
           </w:p>
         </w:tc>
       </w:tr>
@@ -1478,6 +1667,9 @@
         <w:tc>
           <w:tcPr>
             <w:tcW w:w="562" w:type="dxa"/>
+            <w:tcBorders>
+              <w:bottom w:val="single" w:sz="4" w:space="0" w:color="000000"/>
+            </w:tcBorders>
           </w:tcPr>
           <w:p>
             <w:pPr>
@@ -1509,21 +1701,35 @@
               <w:rPr>
                 <w:rFonts w:ascii="Calibri" w:eastAsia="Calibri" w:hAnsi="Calibri" w:cs="Calibri"/>
               </w:rPr>
-              <w:t>Perbaikan</w:t>
-            </w:r>
-            <w:proofErr w:type="spellEnd"/>
-            <w:r>
-              <w:rPr>
-                <w:rFonts w:ascii="Calibri" w:eastAsia="Calibri" w:hAnsi="Calibri" w:cs="Calibri"/>
-              </w:rPr>
-              <w:t xml:space="preserve"> draft </w:t>
-            </w:r>
-            <w:proofErr w:type="spellStart"/>
-            <w:r>
-              <w:rPr>
-                <w:rFonts w:ascii="Calibri" w:eastAsia="Calibri" w:hAnsi="Calibri" w:cs="Calibri"/>
-              </w:rPr>
-              <w:t>hasil</w:t>
+              <w:t>Sertifikat</w:t>
+            </w:r>
+            <w:proofErr w:type="spellEnd"/>
+            <w:r>
+              <w:rPr>
+                <w:rFonts w:ascii="Calibri" w:eastAsia="Calibri" w:hAnsi="Calibri" w:cs="Calibri"/>
+              </w:rPr>
+              <w:t xml:space="preserve"> </w:t>
+            </w:r>
+            <w:proofErr w:type="spellStart"/>
+            <w:r>
+              <w:rPr>
+                <w:rFonts w:ascii="Calibri" w:eastAsia="Calibri" w:hAnsi="Calibri" w:cs="Calibri"/>
+              </w:rPr>
+              <w:t>dapat</w:t>
+            </w:r>
+            <w:proofErr w:type="spellEnd"/>
+            <w:r>
+              <w:rPr>
+                <w:rFonts w:ascii="Calibri" w:eastAsia="Calibri" w:hAnsi="Calibri" w:cs="Calibri"/>
+              </w:rPr>
+              <w:t xml:space="preserve"> </w:t>
+            </w:r>
+            <w:proofErr w:type="spellStart"/>
+            <w:r>
+              <w:rPr>
+                <w:rFonts w:ascii="Calibri" w:eastAsia="Calibri" w:hAnsi="Calibri" w:cs="Calibri"/>
+              </w:rPr>
+              <w:t>Diakses</w:t>
             </w:r>
             <w:proofErr w:type="spellEnd"/>
           </w:p>
@@ -1538,6 +1744,34 @@
                 <w:rFonts w:ascii="Calibri" w:eastAsia="Calibri" w:hAnsi="Calibri" w:cs="Calibri"/>
               </w:rPr>
             </w:pPr>
+            <w:r>
+              <w:rPr>
+                <w:rFonts w:ascii="Calibri" w:eastAsia="Calibri" w:hAnsi="Calibri" w:cs="Calibri"/>
+              </w:rPr>
+              <w:t xml:space="preserve">&lt;&lt;tanggal_sertifikat&gt;&gt;</w:t>
+            </w:r>
+            <w:proofErr w:type="spellStart"/>
+            <w:r>
+              <w:rPr>
+                <w:rFonts w:ascii="Calibri" w:eastAsia="Calibri" w:hAnsi="Calibri" w:cs="Calibri"/>
+              </w:rPr>
+              <w:t xml:space="preserve"/>
+            </w:r>
+            <w:proofErr w:type="spellEnd"/>
+            <w:r>
+              <w:rPr>
+                <w:rFonts w:ascii="Calibri" w:eastAsia="Calibri" w:hAnsi="Calibri" w:cs="Calibri"/>
+              </w:rPr>
+              <w:t xml:space="preserve"/>
+            </w:r>
+            <w:proofErr w:type="spellStart"/>
+            <w:r>
+              <w:rPr>
+                <w:rFonts w:ascii="Calibri" w:eastAsia="Calibri" w:hAnsi="Calibri" w:cs="Calibri"/>
+              </w:rPr>
+              <w:t xml:space="preserve"/>
+            </w:r>
+            <w:proofErr w:type="spellEnd"/>
           </w:p>
         </w:tc>
         <w:tc>
@@ -1550,6 +1784,12 @@
                 <w:rFonts w:ascii="Calibri" w:eastAsia="Calibri" w:hAnsi="Calibri" w:cs="Calibri"/>
               </w:rPr>
             </w:pPr>
+            <w:r>
+              <w:rPr>
+                <w:rFonts w:ascii="Calibri" w:eastAsia="Calibri" w:hAnsi="Calibri" w:cs="Calibri"/>
+              </w:rPr>
+              <w:t xml:space="preserve">&lt;&lt;nama_admin&gt;&gt;</w:t>
+            </w:r>
           </w:p>
         </w:tc>
         <w:tc>
@@ -1562,191 +1802,12 @@
                 <w:rFonts w:ascii="Calibri" w:eastAsia="Calibri" w:hAnsi="Calibri" w:cs="Calibri"/>
               </w:rPr>
             </w:pPr>
-          </w:p>
-        </w:tc>
-      </w:tr>
-      <w:tr>
-        <w:tc>
-          <w:tcPr>
-            <w:tcW w:w="562" w:type="dxa"/>
-          </w:tcPr>
-          <w:p>
-            <w:pPr>
-              <w:numPr>
-                <w:ilvl w:val="0"/>
-                <w:numId w:val="2"/>
-              </w:numPr>
-              <w:spacing w:before="60" w:after="60"/>
-              <w:ind w:left="457"/>
-              <w:rPr>
-                <w:rFonts w:ascii="Calibri" w:eastAsia="Calibri" w:hAnsi="Calibri" w:cs="Calibri"/>
-              </w:rPr>
-            </w:pPr>
-          </w:p>
-        </w:tc>
-        <w:tc>
-          <w:tcPr>
-            <w:tcW w:w="2835" w:type="dxa"/>
-          </w:tcPr>
-          <w:p>
-            <w:pPr>
-              <w:spacing w:before="60"/>
-              <w:rPr>
-                <w:rFonts w:ascii="Calibri" w:eastAsia="Calibri" w:hAnsi="Calibri" w:cs="Calibri"/>
-              </w:rPr>
-            </w:pPr>
-            <w:proofErr w:type="spellStart"/>
-            <w:r>
-              <w:rPr>
-                <w:rFonts w:ascii="Calibri" w:eastAsia="Calibri" w:hAnsi="Calibri" w:cs="Calibri"/>
-              </w:rPr>
-              <w:t>Pembayaran</w:t>
-            </w:r>
-            <w:proofErr w:type="spellEnd"/>
-          </w:p>
-        </w:tc>
-        <w:tc>
-          <w:tcPr>
-            <w:tcW w:w="1674" w:type="dxa"/>
-          </w:tcPr>
-          <w:p>
-            <w:pPr>
-              <w:rPr>
-                <w:rFonts w:ascii="Calibri" w:eastAsia="Calibri" w:hAnsi="Calibri" w:cs="Calibri"/>
-              </w:rPr>
-            </w:pPr>
-          </w:p>
-        </w:tc>
-        <w:tc>
-          <w:tcPr>
-            <w:tcW w:w="2403" w:type="dxa"/>
-          </w:tcPr>
-          <w:p>
-            <w:pPr>
-              <w:rPr>
-                <w:rFonts w:ascii="Calibri" w:eastAsia="Calibri" w:hAnsi="Calibri" w:cs="Calibri"/>
-              </w:rPr>
-            </w:pPr>
-          </w:p>
-        </w:tc>
-        <w:tc>
-          <w:tcPr>
-            <w:tcW w:w="2410" w:type="dxa"/>
-          </w:tcPr>
-          <w:p>
-            <w:pPr>
-              <w:rPr>
-                <w:rFonts w:ascii="Calibri" w:eastAsia="Calibri" w:hAnsi="Calibri" w:cs="Calibri"/>
-              </w:rPr>
-            </w:pPr>
-          </w:p>
-        </w:tc>
-      </w:tr>
-      <w:tr>
-        <w:tc>
-          <w:tcPr>
-            <w:tcW w:w="562" w:type="dxa"/>
-            <w:tcBorders>
-              <w:bottom w:val="single" w:sz="4" w:space="0" w:color="000000"/>
-            </w:tcBorders>
-          </w:tcPr>
-          <w:p>
-            <w:pPr>
-              <w:numPr>
-                <w:ilvl w:val="0"/>
-                <w:numId w:val="2"/>
-              </w:numPr>
-              <w:spacing w:before="60" w:after="60"/>
-              <w:ind w:left="457"/>
-              <w:rPr>
-                <w:rFonts w:ascii="Calibri" w:eastAsia="Calibri" w:hAnsi="Calibri" w:cs="Calibri"/>
-              </w:rPr>
-            </w:pPr>
-          </w:p>
-        </w:tc>
-        <w:tc>
-          <w:tcPr>
-            <w:tcW w:w="2835" w:type="dxa"/>
-          </w:tcPr>
-          <w:p>
-            <w:pPr>
-              <w:spacing w:before="60"/>
-              <w:rPr>
-                <w:rFonts w:ascii="Calibri" w:eastAsia="Calibri" w:hAnsi="Calibri" w:cs="Calibri"/>
-              </w:rPr>
-            </w:pPr>
-            <w:proofErr w:type="spellStart"/>
-            <w:r>
-              <w:rPr>
-                <w:rFonts w:ascii="Calibri" w:eastAsia="Calibri" w:hAnsi="Calibri" w:cs="Calibri"/>
-              </w:rPr>
-              <w:t>Sertifikat</w:t>
-            </w:r>
-            <w:proofErr w:type="spellEnd"/>
-            <w:r>
-              <w:rPr>
-                <w:rFonts w:ascii="Calibri" w:eastAsia="Calibri" w:hAnsi="Calibri" w:cs="Calibri"/>
-              </w:rPr>
-              <w:t xml:space="preserve"> </w:t>
-            </w:r>
-            <w:proofErr w:type="spellStart"/>
-            <w:r>
-              <w:rPr>
-                <w:rFonts w:ascii="Calibri" w:eastAsia="Calibri" w:hAnsi="Calibri" w:cs="Calibri"/>
-              </w:rPr>
-              <w:t>dapat</w:t>
-            </w:r>
-            <w:proofErr w:type="spellEnd"/>
-            <w:r>
-              <w:rPr>
-                <w:rFonts w:ascii="Calibri" w:eastAsia="Calibri" w:hAnsi="Calibri" w:cs="Calibri"/>
-              </w:rPr>
-              <w:t xml:space="preserve"> </w:t>
-            </w:r>
-            <w:proofErr w:type="spellStart"/>
-            <w:r>
-              <w:rPr>
-                <w:rFonts w:ascii="Calibri" w:eastAsia="Calibri" w:hAnsi="Calibri" w:cs="Calibri"/>
-              </w:rPr>
-              <w:t>Diakses</w:t>
-            </w:r>
-            <w:proofErr w:type="spellEnd"/>
-          </w:p>
-        </w:tc>
-        <w:tc>
-          <w:tcPr>
-            <w:tcW w:w="1674" w:type="dxa"/>
-          </w:tcPr>
-          <w:p>
-            <w:pPr>
-              <w:rPr>
-                <w:rFonts w:ascii="Calibri" w:eastAsia="Calibri" w:hAnsi="Calibri" w:cs="Calibri"/>
-              </w:rPr>
-            </w:pPr>
-          </w:p>
-        </w:tc>
-        <w:tc>
-          <w:tcPr>
-            <w:tcW w:w="2403" w:type="dxa"/>
-          </w:tcPr>
-          <w:p>
-            <w:pPr>
-              <w:rPr>
-                <w:rFonts w:ascii="Calibri" w:eastAsia="Calibri" w:hAnsi="Calibri" w:cs="Calibri"/>
-              </w:rPr>
-            </w:pPr>
-          </w:p>
-        </w:tc>
-        <w:tc>
-          <w:tcPr>
-            <w:tcW w:w="2410" w:type="dxa"/>
-          </w:tcPr>
-          <w:p>
-            <w:pPr>
-              <w:rPr>
-                <w:rFonts w:ascii="Calibri" w:eastAsia="Calibri" w:hAnsi="Calibri" w:cs="Calibri"/>
-              </w:rPr>
-            </w:pPr>
+            <w:r>
+              <w:rPr>
+                <w:rFonts w:ascii="Calibri" w:eastAsia="Calibri" w:hAnsi="Calibri" w:cs="Calibri"/>
+              </w:rPr>
+              <w:t xml:space="preserve">Admin</w:t>
+            </w:r>
           </w:p>
         </w:tc>
       </w:tr>

</xml_diff>